<commit_message>
TS 2.4 Kramam files corrections
</commit_message>
<xml_diff>
--- a/TS-Kramam/TS-2.4/TS 2.4 Sanskrit Krama Paatam Corrections.docx
+++ b/TS-Kramam/TS-2.4/TS 2.4 Sanskrit Krama Paatam Corrections.docx
@@ -51,7 +51,7 @@
           <w:szCs w:val="32"/>
           <w:u w:val="single"/>
         </w:rPr>
-        <w:t xml:space="preserve">2.4 </w:t>
+        <w:t>2.4 Sanskrit</w:t>
       </w:r>
       <w:r>
         <w:rPr>
@@ -61,8 +61,9 @@
           <w:szCs w:val="32"/>
           <w:u w:val="single"/>
         </w:rPr>
-        <w:t>Sanskrit</w:t>
+        <w:t xml:space="preserve"> Corrections –Observed </w:t>
       </w:r>
+      <w:proofErr w:type="gramStart"/>
       <w:r>
         <w:rPr>
           <w:b/>
@@ -71,7 +72,7 @@
           <w:szCs w:val="32"/>
           <w:u w:val="single"/>
         </w:rPr>
-        <w:t xml:space="preserve"> Corrections –Observed till </w:t>
+        <w:t xml:space="preserve">till </w:t>
       </w:r>
       <w:r>
         <w:rPr>
@@ -84,6 +85,7 @@
         </w:rPr>
         <w:t>????</w:t>
       </w:r>
+      <w:proofErr w:type="gramEnd"/>
     </w:p>
     <w:p>
       <w:pPr>
@@ -130,12 +132,16 @@
               <w:spacing w:before="0" w:line="240" w:lineRule="auto"/>
               <w:jc w:val="center"/>
               <w:rPr>
-                <w:sz w:val="32"/>
-                <w:szCs w:val="32"/>
-              </w:rPr>
-            </w:pPr>
-            <w:r>
-              <w:rPr>
+                <w:b/>
+                <w:bCs/>
+                <w:sz w:val="32"/>
+                <w:szCs w:val="32"/>
+              </w:rPr>
+            </w:pPr>
+            <w:r>
+              <w:rPr>
+                <w:b/>
+                <w:bCs/>
                 <w:sz w:val="32"/>
                 <w:szCs w:val="32"/>
               </w:rPr>
@@ -147,12 +153,16 @@
               <w:spacing w:before="0" w:line="240" w:lineRule="auto"/>
               <w:jc w:val="center"/>
               <w:rPr>
-                <w:sz w:val="32"/>
-                <w:szCs w:val="32"/>
-              </w:rPr>
-            </w:pPr>
-            <w:r>
-              <w:rPr>
+                <w:b/>
+                <w:bCs/>
+                <w:sz w:val="32"/>
+                <w:szCs w:val="32"/>
+              </w:rPr>
+            </w:pPr>
+            <w:r>
+              <w:rPr>
+                <w:b/>
+                <w:bCs/>
                 <w:sz w:val="32"/>
                 <w:szCs w:val="32"/>
               </w:rPr>
@@ -169,12 +179,16 @@
               <w:spacing w:before="0" w:line="240" w:lineRule="auto"/>
               <w:jc w:val="center"/>
               <w:rPr>
-                <w:sz w:val="32"/>
-                <w:szCs w:val="32"/>
-              </w:rPr>
-            </w:pPr>
-            <w:r>
-              <w:rPr>
+                <w:b/>
+                <w:bCs/>
+                <w:sz w:val="32"/>
+                <w:szCs w:val="32"/>
+              </w:rPr>
+            </w:pPr>
+            <w:r>
+              <w:rPr>
+                <w:b/>
+                <w:bCs/>
                 <w:sz w:val="32"/>
                 <w:szCs w:val="32"/>
               </w:rPr>
@@ -192,12 +206,16 @@
               <w:ind w:right="-18"/>
               <w:jc w:val="center"/>
               <w:rPr>
-                <w:sz w:val="32"/>
-                <w:szCs w:val="32"/>
-              </w:rPr>
-            </w:pPr>
-            <w:r>
-              <w:rPr>
+                <w:b/>
+                <w:bCs/>
+                <w:sz w:val="32"/>
+                <w:szCs w:val="32"/>
+              </w:rPr>
+            </w:pPr>
+            <w:r>
+              <w:rPr>
+                <w:b/>
+                <w:bCs/>
                 <w:sz w:val="32"/>
                 <w:szCs w:val="32"/>
               </w:rPr>
@@ -247,6 +265,703 @@
                 <w:szCs w:val="28"/>
                 <w:lang w:val="it-IT"/>
               </w:rPr>
+              <w:t>11.5</w:t>
+            </w:r>
+            <w:r>
+              <w:rPr>
+                <w:rFonts w:cs="Arial"/>
+                <w:b/>
+                <w:sz w:val="28"/>
+                <w:szCs w:val="28"/>
+                <w:lang w:val="it-IT"/>
+              </w:rPr>
+              <w:t xml:space="preserve"> - Kramam</w:t>
+            </w:r>
+          </w:p>
+          <w:p>
+            <w:pPr>
+              <w:widowControl w:val="0"/>
+              <w:autoSpaceDE w:val="0"/>
+              <w:autoSpaceDN w:val="0"/>
+              <w:adjustRightInd w:val="0"/>
+              <w:spacing w:before="0" w:line="240" w:lineRule="auto"/>
+              <w:rPr>
+                <w:rFonts w:cs="Arial"/>
+                <w:b/>
+                <w:sz w:val="28"/>
+                <w:szCs w:val="28"/>
+                <w:lang w:val="it-IT"/>
+              </w:rPr>
+            </w:pPr>
+            <w:r>
+              <w:rPr>
+                <w:rFonts w:cs="Arial"/>
+                <w:b/>
+                <w:sz w:val="28"/>
+                <w:szCs w:val="28"/>
+                <w:lang w:val="it-IT"/>
+              </w:rPr>
+              <w:t xml:space="preserve">Krama Vaakyam No. - </w:t>
+            </w:r>
+            <w:r>
+              <w:rPr>
+                <w:rFonts w:cs="Arial"/>
+                <w:b/>
+                <w:sz w:val="28"/>
+                <w:szCs w:val="28"/>
+                <w:lang w:val="it-IT"/>
+              </w:rPr>
+              <w:t>47</w:t>
+            </w:r>
+            <w:r>
+              <w:rPr>
+                <w:rFonts w:cs="Arial"/>
+                <w:b/>
+                <w:sz w:val="28"/>
+                <w:szCs w:val="28"/>
+                <w:lang w:val="it-IT"/>
+              </w:rPr>
+              <w:br/>
+              <w:t xml:space="preserve">Panchaati No. - </w:t>
+            </w:r>
+            <w:r>
+              <w:rPr>
+                <w:rFonts w:cs="Arial"/>
+                <w:b/>
+                <w:sz w:val="28"/>
+                <w:szCs w:val="28"/>
+                <w:lang w:val="it-IT"/>
+              </w:rPr>
+              <w:t>34</w:t>
+            </w:r>
+          </w:p>
+        </w:tc>
+        <w:tc>
+          <w:tcPr>
+            <w:tcW w:w="4738" w:type="dxa"/>
+          </w:tcPr>
+          <w:p>
+            <w:pPr>
+              <w:spacing w:before="0" w:line="240" w:lineRule="auto"/>
+              <w:rPr>
+                <w:rFonts w:ascii="BRH Devanagari Extra" w:hAnsi="BRH Devanagari Extra" w:cs="BRH Devanagari Extra"/>
+                <w:color w:val="000000"/>
+                <w:sz w:val="40"/>
+                <w:szCs w:val="40"/>
+              </w:rPr>
+            </w:pPr>
+            <w:proofErr w:type="spellStart"/>
+            <w:r>
+              <w:rPr>
+                <w:rFonts w:ascii="BRH Devanagari Extra" w:hAnsi="BRH Devanagari Extra" w:cs="BRH Devanagari Extra"/>
+                <w:color w:val="000000"/>
+                <w:sz w:val="40"/>
+                <w:szCs w:val="40"/>
+              </w:rPr>
+              <w:t>xÉqÉ×þSèkrÉÉ</w:t>
+            </w:r>
+            <w:proofErr w:type="spellEnd"/>
+            <w:r>
+              <w:rPr>
+                <w:rFonts w:ascii="BRH Malayalam Extra" w:hAnsi="BRH Malayalam Extra" w:cs="BRH Devanagari Extra"/>
+                <w:b/>
+                <w:color w:val="000000"/>
+                <w:sz w:val="32"/>
+                <w:szCs w:val="40"/>
+              </w:rPr>
+              <w:t>–</w:t>
+            </w:r>
+            <w:r>
+              <w:rPr>
+                <w:rFonts w:ascii="BRH Devanagari Extra" w:hAnsi="BRH Devanagari Extra" w:cs="BRH Devanagari Extra"/>
+                <w:color w:val="000000"/>
+                <w:sz w:val="40"/>
+                <w:szCs w:val="40"/>
+              </w:rPr>
+              <w:t xml:space="preserve"> </w:t>
+            </w:r>
+            <w:proofErr w:type="spellStart"/>
+            <w:r>
+              <w:rPr>
+                <w:rFonts w:ascii="BRH Devanagari Extra" w:hAnsi="BRH Devanagari Extra" w:cs="BRH Devanagari Extra"/>
+                <w:color w:val="000000"/>
+                <w:sz w:val="40"/>
+                <w:szCs w:val="40"/>
+              </w:rPr>
+              <w:t>CÌiÉ</w:t>
+            </w:r>
+            <w:proofErr w:type="spellEnd"/>
+            <w:r>
+              <w:rPr>
+                <w:rFonts w:ascii="BRH Malayalam Extra" w:hAnsi="BRH Malayalam Extra" w:cs="BRH Devanagari Extra"/>
+                <w:b/>
+                <w:color w:val="000000"/>
+                <w:sz w:val="32"/>
+                <w:szCs w:val="40"/>
+              </w:rPr>
+              <w:t>–</w:t>
+            </w:r>
+            <w:r>
+              <w:rPr>
+                <w:rFonts w:ascii="BRH Devanagari Extra" w:hAnsi="BRH Devanagari Extra" w:cs="BRH Devanagari Extra"/>
+                <w:color w:val="000000"/>
+                <w:sz w:val="40"/>
+                <w:szCs w:val="40"/>
+              </w:rPr>
+              <w:t xml:space="preserve"> </w:t>
+            </w:r>
+            <w:proofErr w:type="spellStart"/>
+            <w:r>
+              <w:rPr>
+                <w:rFonts w:ascii="BRH Devanagari Extra" w:hAnsi="BRH Devanagari Extra" w:cs="BRH Devanagari Extra"/>
+                <w:color w:val="000000"/>
+                <w:sz w:val="40"/>
+                <w:szCs w:val="40"/>
+              </w:rPr>
+              <w:t>xÉqÉç</w:t>
+            </w:r>
+            <w:proofErr w:type="spellEnd"/>
+            <w:r>
+              <w:rPr>
+                <w:rFonts w:ascii="BRH Devanagari Extra" w:hAnsi="BRH Devanagari Extra" w:cs="BRH Devanagari Extra"/>
+                <w:color w:val="000000"/>
+                <w:sz w:val="40"/>
+                <w:szCs w:val="40"/>
+              </w:rPr>
+              <w:t xml:space="preserve"> - G</w:t>
+            </w:r>
+            <w:r>
+              <w:rPr>
+                <w:rFonts w:ascii="BRH Malayalam Extra" w:hAnsi="BRH Malayalam Extra" w:cs="BRH Devanagari Extra"/>
+                <w:b/>
+                <w:color w:val="000000"/>
+                <w:sz w:val="32"/>
+                <w:szCs w:val="40"/>
+              </w:rPr>
+              <w:t>–</w:t>
+            </w:r>
+            <w:proofErr w:type="spellStart"/>
+            <w:r>
+              <w:rPr>
+                <w:rFonts w:ascii="BRH Devanagari Extra" w:hAnsi="BRH Devanagari Extra" w:cs="BRH Devanagari Extra"/>
+                <w:color w:val="000000"/>
+                <w:sz w:val="40"/>
+                <w:szCs w:val="40"/>
+                <w:highlight w:val="yellow"/>
+              </w:rPr>
+              <w:t>SèkrÉå</w:t>
+            </w:r>
+            <w:proofErr w:type="spellEnd"/>
+            <w:r>
+              <w:rPr>
+                <w:rFonts w:ascii="BRH Malayalam Extra" w:hAnsi="BRH Malayalam Extra" w:cs="BRH Devanagari Extra"/>
+                <w:b/>
+                <w:color w:val="000000"/>
+                <w:sz w:val="32"/>
+                <w:szCs w:val="40"/>
+                <w:highlight w:val="yellow"/>
+              </w:rPr>
+              <w:t>–</w:t>
+            </w:r>
+            <w:r>
+              <w:rPr>
+                <w:rFonts w:ascii="BRH Devanagari Extra" w:hAnsi="BRH Devanagari Extra" w:cs="BRH Devanagari Extra"/>
+                <w:color w:val="000000"/>
+                <w:sz w:val="40"/>
+                <w:szCs w:val="40"/>
+                <w:highlight w:val="yellow"/>
+              </w:rPr>
+              <w:t xml:space="preserve"> |</w:t>
+            </w:r>
+          </w:p>
+        </w:tc>
+        <w:tc>
+          <w:tcPr>
+            <w:tcW w:w="5220" w:type="dxa"/>
+          </w:tcPr>
+          <w:p>
+            <w:pPr>
+              <w:widowControl w:val="0"/>
+              <w:autoSpaceDE w:val="0"/>
+              <w:autoSpaceDN w:val="0"/>
+              <w:adjustRightInd w:val="0"/>
+              <w:spacing w:before="0" w:line="264" w:lineRule="auto"/>
+              <w:rPr>
+                <w:rFonts w:ascii="BRH Devanagari Extra" w:hAnsi="BRH Devanagari Extra" w:cs="BRH Devanagari Extra"/>
+                <w:color w:val="000000"/>
+                <w:sz w:val="40"/>
+                <w:szCs w:val="40"/>
+              </w:rPr>
+            </w:pPr>
+            <w:proofErr w:type="spellStart"/>
+            <w:r>
+              <w:rPr>
+                <w:rFonts w:ascii="BRH Devanagari Extra" w:hAnsi="BRH Devanagari Extra" w:cs="BRH Devanagari Extra"/>
+                <w:color w:val="000000"/>
+                <w:sz w:val="40"/>
+                <w:szCs w:val="40"/>
+              </w:rPr>
+              <w:t>xÉqÉ×þSèkrÉÉ</w:t>
+            </w:r>
+            <w:proofErr w:type="spellEnd"/>
+            <w:r>
+              <w:rPr>
+                <w:rFonts w:ascii="BRH Malayalam Extra" w:hAnsi="BRH Malayalam Extra" w:cs="BRH Devanagari Extra"/>
+                <w:b/>
+                <w:color w:val="000000"/>
+                <w:sz w:val="32"/>
+                <w:szCs w:val="40"/>
+              </w:rPr>
+              <w:t>–</w:t>
+            </w:r>
+            <w:r>
+              <w:rPr>
+                <w:rFonts w:ascii="BRH Devanagari Extra" w:hAnsi="BRH Devanagari Extra" w:cs="BRH Devanagari Extra"/>
+                <w:color w:val="000000"/>
+                <w:sz w:val="40"/>
+                <w:szCs w:val="40"/>
+              </w:rPr>
+              <w:t xml:space="preserve"> </w:t>
+            </w:r>
+            <w:proofErr w:type="spellStart"/>
+            <w:r>
+              <w:rPr>
+                <w:rFonts w:ascii="BRH Devanagari Extra" w:hAnsi="BRH Devanagari Extra" w:cs="BRH Devanagari Extra"/>
+                <w:color w:val="000000"/>
+                <w:sz w:val="40"/>
+                <w:szCs w:val="40"/>
+              </w:rPr>
+              <w:t>CÌiÉ</w:t>
+            </w:r>
+            <w:proofErr w:type="spellEnd"/>
+            <w:r>
+              <w:rPr>
+                <w:rFonts w:ascii="BRH Malayalam Extra" w:hAnsi="BRH Malayalam Extra" w:cs="BRH Devanagari Extra"/>
+                <w:b/>
+                <w:color w:val="000000"/>
+                <w:sz w:val="32"/>
+                <w:szCs w:val="40"/>
+              </w:rPr>
+              <w:t>–</w:t>
+            </w:r>
+            <w:r>
+              <w:rPr>
+                <w:rFonts w:ascii="BRH Devanagari Extra" w:hAnsi="BRH Devanagari Extra" w:cs="BRH Devanagari Extra"/>
+                <w:color w:val="000000"/>
+                <w:sz w:val="40"/>
+                <w:szCs w:val="40"/>
+              </w:rPr>
+              <w:t xml:space="preserve"> </w:t>
+            </w:r>
+            <w:proofErr w:type="spellStart"/>
+            <w:r>
+              <w:rPr>
+                <w:rFonts w:ascii="BRH Devanagari Extra" w:hAnsi="BRH Devanagari Extra" w:cs="BRH Devanagari Extra"/>
+                <w:color w:val="000000"/>
+                <w:sz w:val="40"/>
+                <w:szCs w:val="40"/>
+              </w:rPr>
+              <w:t>xÉqÉç</w:t>
+            </w:r>
+            <w:proofErr w:type="spellEnd"/>
+            <w:r>
+              <w:rPr>
+                <w:rFonts w:ascii="BRH Devanagari Extra" w:hAnsi="BRH Devanagari Extra" w:cs="BRH Devanagari Extra"/>
+                <w:color w:val="000000"/>
+                <w:sz w:val="40"/>
+                <w:szCs w:val="40"/>
+              </w:rPr>
+              <w:t xml:space="preserve"> - G</w:t>
+            </w:r>
+            <w:r>
+              <w:rPr>
+                <w:rFonts w:ascii="BRH Malayalam Extra" w:hAnsi="BRH Malayalam Extra" w:cs="BRH Devanagari Extra"/>
+                <w:b/>
+                <w:color w:val="000000"/>
+                <w:sz w:val="32"/>
+                <w:szCs w:val="40"/>
+                <w:highlight w:val="green"/>
+              </w:rPr>
+              <w:t>–</w:t>
+            </w:r>
+            <w:proofErr w:type="spellStart"/>
+            <w:r>
+              <w:rPr>
+                <w:rFonts w:ascii="BRH Devanagari Extra" w:hAnsi="BRH Devanagari Extra" w:cs="BRH Devanagari Extra"/>
+                <w:color w:val="000000"/>
+                <w:sz w:val="40"/>
+                <w:szCs w:val="40"/>
+                <w:highlight w:val="green"/>
+              </w:rPr>
+              <w:t>SèkrÉ</w:t>
+            </w:r>
+            <w:proofErr w:type="spellEnd"/>
+            <w:r>
+              <w:rPr>
+                <w:rFonts w:ascii="BRH Malayalam Extra" w:hAnsi="BRH Malayalam Extra" w:cs="BRH Devanagari Extra"/>
+                <w:b/>
+                <w:color w:val="000000"/>
+                <w:sz w:val="32"/>
+                <w:szCs w:val="40"/>
+                <w:highlight w:val="green"/>
+              </w:rPr>
+              <w:t>–</w:t>
+            </w:r>
+            <w:r>
+              <w:rPr>
+                <w:rFonts w:ascii="BRH Devanagari Extra" w:hAnsi="BRH Devanagari Extra" w:cs="BRH Devanagari Extra"/>
+                <w:color w:val="000000"/>
+                <w:sz w:val="40"/>
+                <w:szCs w:val="40"/>
+                <w:highlight w:val="green"/>
+              </w:rPr>
+              <w:t>æ</w:t>
+            </w:r>
+          </w:p>
+        </w:tc>
+      </w:tr>
+      <w:tr>
+        <w:trPr>
+          <w:trHeight w:val="680"/>
+        </w:trPr>
+        <w:tc>
+          <w:tcPr>
+            <w:tcW w:w="3877" w:type="dxa"/>
+          </w:tcPr>
+          <w:p>
+            <w:pPr>
+              <w:widowControl w:val="0"/>
+              <w:autoSpaceDE w:val="0"/>
+              <w:autoSpaceDN w:val="0"/>
+              <w:adjustRightInd w:val="0"/>
+              <w:spacing w:before="0" w:line="240" w:lineRule="auto"/>
+              <w:rPr>
+                <w:rFonts w:cs="Arial"/>
+                <w:b/>
+                <w:sz w:val="28"/>
+                <w:szCs w:val="28"/>
+                <w:lang w:val="it-IT"/>
+              </w:rPr>
+            </w:pPr>
+            <w:r>
+              <w:rPr>
+                <w:rFonts w:cs="Arial"/>
+                <w:b/>
+                <w:sz w:val="28"/>
+                <w:szCs w:val="28"/>
+                <w:lang w:val="it-IT"/>
+              </w:rPr>
+              <w:t>TS 2.4.</w:t>
+            </w:r>
+            <w:r>
+              <w:rPr>
+                <w:rFonts w:cs="Arial"/>
+                <w:b/>
+                <w:sz w:val="28"/>
+                <w:szCs w:val="28"/>
+                <w:lang w:val="it-IT"/>
+              </w:rPr>
+              <w:t>14.3</w:t>
+            </w:r>
+            <w:r>
+              <w:rPr>
+                <w:rFonts w:cs="Arial"/>
+                <w:b/>
+                <w:sz w:val="28"/>
+                <w:szCs w:val="28"/>
+                <w:lang w:val="it-IT"/>
+              </w:rPr>
+              <w:t xml:space="preserve"> - Kramam</w:t>
+            </w:r>
+          </w:p>
+          <w:p>
+            <w:pPr>
+              <w:widowControl w:val="0"/>
+              <w:autoSpaceDE w:val="0"/>
+              <w:autoSpaceDN w:val="0"/>
+              <w:adjustRightInd w:val="0"/>
+              <w:spacing w:before="0" w:line="240" w:lineRule="auto"/>
+              <w:rPr>
+                <w:rFonts w:cs="Arial"/>
+                <w:b/>
+                <w:sz w:val="28"/>
+                <w:szCs w:val="28"/>
+                <w:lang w:val="it-IT"/>
+              </w:rPr>
+            </w:pPr>
+            <w:r>
+              <w:rPr>
+                <w:rFonts w:cs="Arial"/>
+                <w:b/>
+                <w:sz w:val="28"/>
+                <w:szCs w:val="28"/>
+                <w:lang w:val="it-IT"/>
+              </w:rPr>
+              <w:t xml:space="preserve">Krama Vaakyam No. - </w:t>
+            </w:r>
+            <w:r>
+              <w:rPr>
+                <w:rFonts w:cs="Arial"/>
+                <w:b/>
+                <w:sz w:val="28"/>
+                <w:szCs w:val="28"/>
+                <w:lang w:val="it-IT"/>
+              </w:rPr>
+              <w:t>24</w:t>
+            </w:r>
+            <w:r>
+              <w:rPr>
+                <w:rFonts w:cs="Arial"/>
+                <w:b/>
+                <w:sz w:val="28"/>
+                <w:szCs w:val="28"/>
+                <w:lang w:val="it-IT"/>
+              </w:rPr>
+              <w:br/>
+              <w:t xml:space="preserve">Panchaati No. - </w:t>
+            </w:r>
+            <w:r>
+              <w:rPr>
+                <w:rFonts w:cs="Arial"/>
+                <w:b/>
+                <w:sz w:val="28"/>
+                <w:szCs w:val="28"/>
+                <w:lang w:val="it-IT"/>
+              </w:rPr>
+              <w:t>46</w:t>
+            </w:r>
+          </w:p>
+        </w:tc>
+        <w:tc>
+          <w:tcPr>
+            <w:tcW w:w="4738" w:type="dxa"/>
+          </w:tcPr>
+          <w:p>
+            <w:pPr>
+              <w:spacing w:before="0" w:line="240" w:lineRule="auto"/>
+              <w:rPr>
+                <w:rFonts w:ascii="BRH Devanagari Extra" w:hAnsi="BRH Devanagari Extra" w:cs="BRH Devanagari Extra"/>
+                <w:color w:val="000000"/>
+                <w:sz w:val="40"/>
+                <w:szCs w:val="40"/>
+              </w:rPr>
+            </w:pPr>
+            <w:r>
+              <w:rPr>
+                <w:rFonts w:ascii="BRH Devanagari Extra" w:hAnsi="BRH Devanagari Extra" w:cs="BRH Devanagari Extra"/>
+                <w:color w:val="000000"/>
+                <w:sz w:val="40"/>
+                <w:szCs w:val="40"/>
+                <w:highlight w:val="yellow"/>
+              </w:rPr>
+              <w:t>rÉ ±</w:t>
+            </w:r>
+            <w:proofErr w:type="spellStart"/>
+            <w:r>
+              <w:rPr>
+                <w:rFonts w:ascii="BRH Devanagari Extra" w:hAnsi="BRH Devanagari Extra" w:cs="BRH Devanagari Extra"/>
+                <w:color w:val="000000"/>
+                <w:sz w:val="40"/>
+                <w:szCs w:val="40"/>
+              </w:rPr>
+              <w:t>ÉuÉþÈ</w:t>
+            </w:r>
+            <w:proofErr w:type="spellEnd"/>
+            <w:r>
+              <w:rPr>
+                <w:rFonts w:ascii="BRH Devanagari Extra" w:hAnsi="BRH Devanagari Extra" w:cs="BRH Devanagari Extra"/>
+                <w:color w:val="000000"/>
+                <w:sz w:val="40"/>
+                <w:szCs w:val="40"/>
+              </w:rPr>
+              <w:t xml:space="preserve"> | ±</w:t>
+            </w:r>
+            <w:proofErr w:type="spellStart"/>
+            <w:r>
+              <w:rPr>
+                <w:rFonts w:ascii="BRH Devanagari Extra" w:hAnsi="BRH Devanagari Extra" w:cs="BRH Devanagari Extra"/>
+                <w:color w:val="000000"/>
+                <w:sz w:val="40"/>
+                <w:szCs w:val="40"/>
+              </w:rPr>
+              <w:t>ÉuÉþ</w:t>
+            </w:r>
+            <w:proofErr w:type="spellEnd"/>
+            <w:r>
+              <w:rPr>
+                <w:rFonts w:ascii="BRH Devanagari Extra" w:hAnsi="BRH Devanagari Extra" w:cs="BRH Devanagari Extra"/>
+                <w:color w:val="000000"/>
+                <w:sz w:val="40"/>
+                <w:szCs w:val="40"/>
+              </w:rPr>
+              <w:t xml:space="preserve"> </w:t>
+            </w:r>
+            <w:proofErr w:type="spellStart"/>
+            <w:r>
+              <w:rPr>
+                <w:rFonts w:ascii="BRH Devanagari Extra" w:hAnsi="BRH Devanagari Extra" w:cs="BRH Devanagari Extra"/>
+                <w:color w:val="000000"/>
+                <w:sz w:val="40"/>
+                <w:szCs w:val="40"/>
+              </w:rPr>
+              <w:t>ClSì</w:t>
+            </w:r>
+            <w:proofErr w:type="spellEnd"/>
+            <w:r>
+              <w:rPr>
+                <w:rFonts w:ascii="BRH Devanagari Extra" w:hAnsi="BRH Devanagari Extra" w:cs="BRH Devanagari Extra"/>
+                <w:color w:val="000000"/>
+                <w:sz w:val="40"/>
+                <w:szCs w:val="40"/>
+              </w:rPr>
+              <w:t xml:space="preserve"> |</w:t>
+            </w:r>
+          </w:p>
+        </w:tc>
+        <w:tc>
+          <w:tcPr>
+            <w:tcW w:w="5220" w:type="dxa"/>
+          </w:tcPr>
+          <w:p>
+            <w:pPr>
+              <w:widowControl w:val="0"/>
+              <w:autoSpaceDE w:val="0"/>
+              <w:autoSpaceDN w:val="0"/>
+              <w:adjustRightInd w:val="0"/>
+              <w:spacing w:before="0" w:line="264" w:lineRule="auto"/>
+              <w:rPr>
+                <w:rFonts w:ascii="BRH Devanagari Extra" w:hAnsi="BRH Devanagari Extra" w:cs="BRH Devanagari Extra"/>
+                <w:color w:val="000000"/>
+                <w:sz w:val="40"/>
+                <w:szCs w:val="40"/>
+              </w:rPr>
+            </w:pPr>
+            <w:proofErr w:type="spellStart"/>
+            <w:r>
+              <w:rPr>
+                <w:rFonts w:ascii="BRH Devanagari Extra" w:hAnsi="BRH Devanagari Extra" w:cs="BRH Devanagari Extra"/>
+                <w:color w:val="000000"/>
+                <w:sz w:val="40"/>
+                <w:szCs w:val="40"/>
+                <w:highlight w:val="green"/>
+              </w:rPr>
+              <w:t>rÉSè</w:t>
+            </w:r>
+            <w:proofErr w:type="spellEnd"/>
+            <w:r>
+              <w:rPr>
+                <w:rFonts w:ascii="BRH Devanagari Extra" w:hAnsi="BRH Devanagari Extra" w:cs="BRH Devanagari Extra"/>
+                <w:color w:val="000000"/>
+                <w:sz w:val="40"/>
+                <w:szCs w:val="40"/>
+                <w:highlight w:val="green"/>
+              </w:rPr>
+              <w:t xml:space="preserve"> ±</w:t>
+            </w:r>
+            <w:proofErr w:type="spellStart"/>
+            <w:r>
+              <w:rPr>
+                <w:rFonts w:ascii="BRH Devanagari Extra" w:hAnsi="BRH Devanagari Extra" w:cs="BRH Devanagari Extra"/>
+                <w:color w:val="000000"/>
+                <w:sz w:val="40"/>
+                <w:szCs w:val="40"/>
+              </w:rPr>
+              <w:t>ÉuÉþÈ</w:t>
+            </w:r>
+            <w:proofErr w:type="spellEnd"/>
+            <w:r>
+              <w:rPr>
+                <w:rFonts w:ascii="BRH Devanagari Extra" w:hAnsi="BRH Devanagari Extra" w:cs="BRH Devanagari Extra"/>
+                <w:color w:val="000000"/>
+                <w:sz w:val="40"/>
+                <w:szCs w:val="40"/>
+              </w:rPr>
+              <w:t xml:space="preserve"> | ±</w:t>
+            </w:r>
+            <w:proofErr w:type="spellStart"/>
+            <w:r>
+              <w:rPr>
+                <w:rFonts w:ascii="BRH Devanagari Extra" w:hAnsi="BRH Devanagari Extra" w:cs="BRH Devanagari Extra"/>
+                <w:color w:val="000000"/>
+                <w:sz w:val="40"/>
+                <w:szCs w:val="40"/>
+              </w:rPr>
+              <w:t>ÉuÉþ</w:t>
+            </w:r>
+            <w:proofErr w:type="spellEnd"/>
+            <w:r>
+              <w:rPr>
+                <w:rFonts w:ascii="BRH Devanagari Extra" w:hAnsi="BRH Devanagari Extra" w:cs="BRH Devanagari Extra"/>
+                <w:color w:val="000000"/>
+                <w:sz w:val="40"/>
+                <w:szCs w:val="40"/>
+              </w:rPr>
+              <w:t xml:space="preserve"> </w:t>
+            </w:r>
+            <w:proofErr w:type="spellStart"/>
+            <w:r>
+              <w:rPr>
+                <w:rFonts w:ascii="BRH Devanagari Extra" w:hAnsi="BRH Devanagari Extra" w:cs="BRH Devanagari Extra"/>
+                <w:color w:val="000000"/>
+                <w:sz w:val="40"/>
+                <w:szCs w:val="40"/>
+              </w:rPr>
+              <w:t>ClSì</w:t>
+            </w:r>
+            <w:proofErr w:type="spellEnd"/>
+            <w:r>
+              <w:rPr>
+                <w:rFonts w:ascii="BRH Devanagari Extra" w:hAnsi="BRH Devanagari Extra" w:cs="BRH Devanagari Extra"/>
+                <w:color w:val="000000"/>
+                <w:sz w:val="40"/>
+                <w:szCs w:val="40"/>
+              </w:rPr>
+              <w:t xml:space="preserve"> |</w:t>
+            </w:r>
+          </w:p>
+        </w:tc>
+      </w:tr>
+      <w:tr>
+        <w:trPr>
+          <w:trHeight w:val="680"/>
+        </w:trPr>
+        <w:tc>
+          <w:tcPr>
+            <w:tcW w:w="3877" w:type="dxa"/>
+          </w:tcPr>
+          <w:p>
+            <w:pPr>
+              <w:widowControl w:val="0"/>
+              <w:autoSpaceDE w:val="0"/>
+              <w:autoSpaceDN w:val="0"/>
+              <w:adjustRightInd w:val="0"/>
+              <w:spacing w:before="0" w:line="240" w:lineRule="auto"/>
+              <w:rPr>
+                <w:rFonts w:cs="Arial"/>
+                <w:b/>
+                <w:sz w:val="28"/>
+                <w:szCs w:val="28"/>
+                <w:lang w:val="it-IT"/>
+              </w:rPr>
+            </w:pPr>
+            <w:r>
+              <w:rPr>
+                <w:rFonts w:cs="Arial"/>
+                <w:b/>
+                <w:sz w:val="28"/>
+                <w:szCs w:val="28"/>
+                <w:lang w:val="it-IT"/>
+              </w:rPr>
+              <w:t>TS 2.4.</w:t>
+            </w:r>
+            <w:r>
+              <w:rPr>
+                <w:rFonts w:cs="Arial"/>
+                <w:b/>
+                <w:sz w:val="28"/>
+                <w:szCs w:val="28"/>
+                <w:lang w:val="it-IT"/>
+              </w:rPr>
               <w:t>14.4</w:t>
             </w:r>
             <w:r>
@@ -338,6 +1053,7 @@
                 <w:lang w:val="it-IT"/>
               </w:rPr>
             </w:pPr>
+            <w:proofErr w:type="spellStart"/>
             <w:r>
               <w:rPr>
                 <w:rFonts w:ascii="BRH Devanagari Extra" w:hAnsi="BRH Devanagari Extra" w:cs="BRH Devanagari Extra"/>
@@ -347,16 +1063,18 @@
               </w:rPr>
               <w:t>qÉSå</w:t>
             </w:r>
-            <w:r>
-              <w:rPr>
-                <w:rFonts w:ascii="BRH Malayalam Extra" w:hAnsi="BRH Malayalam Extra" w:cs="BRH Devanagari Extra"/>
-                <w:b/>
-                <w:color w:val="000000"/>
-                <w:sz w:val="32"/>
-                <w:szCs w:val="40"/>
-              </w:rPr>
-              <w:t>–</w:t>
-            </w:r>
+            <w:proofErr w:type="spellEnd"/>
+            <w:r>
+              <w:rPr>
+                <w:rFonts w:ascii="BRH Malayalam Extra" w:hAnsi="BRH Malayalam Extra" w:cs="BRH Devanagari Extra"/>
+                <w:b/>
+                <w:color w:val="000000"/>
+                <w:sz w:val="32"/>
+                <w:szCs w:val="40"/>
+              </w:rPr>
+              <w:t>–</w:t>
+            </w:r>
+            <w:proofErr w:type="spellStart"/>
             <w:r>
               <w:rPr>
                 <w:rFonts w:ascii="BRH Devanagari Extra" w:hAnsi="BRH Devanagari Extra" w:cs="BRH Devanagari Extra"/>
@@ -366,24 +1084,35 @@
               </w:rPr>
               <w:t>qÉåÌiÉ</w:t>
             </w:r>
-            <w:r>
-              <w:rPr>
-                <w:rFonts w:ascii="BRH Malayalam Extra" w:hAnsi="BRH Malayalam Extra" w:cs="BRH Devanagari Extra"/>
-                <w:b/>
-                <w:color w:val="000000"/>
-                <w:sz w:val="32"/>
-                <w:szCs w:val="40"/>
-              </w:rPr>
-              <w:t>–</w:t>
-            </w:r>
-            <w:r>
-              <w:rPr>
-                <w:rFonts w:ascii="BRH Devanagari Extra" w:hAnsi="BRH Devanagari Extra" w:cs="BRH Devanagari Extra"/>
-                <w:color w:val="000000"/>
-                <w:sz w:val="40"/>
-                <w:szCs w:val="40"/>
-              </w:rPr>
-              <w:t xml:space="preserve"> qÉ</w:t>
+            <w:proofErr w:type="spellEnd"/>
+            <w:r>
+              <w:rPr>
+                <w:rFonts w:ascii="BRH Malayalam Extra" w:hAnsi="BRH Malayalam Extra" w:cs="BRH Devanagari Extra"/>
+                <w:b/>
+                <w:color w:val="000000"/>
+                <w:sz w:val="32"/>
+                <w:szCs w:val="40"/>
+              </w:rPr>
+              <w:t>–</w:t>
+            </w:r>
+            <w:r>
+              <w:rPr>
+                <w:rFonts w:ascii="BRH Devanagari Extra" w:hAnsi="BRH Devanagari Extra" w:cs="BRH Devanagari Extra"/>
+                <w:color w:val="000000"/>
+                <w:sz w:val="40"/>
+                <w:szCs w:val="40"/>
+              </w:rPr>
+              <w:t xml:space="preserve"> </w:t>
+            </w:r>
+            <w:proofErr w:type="spellStart"/>
+            <w:r>
+              <w:rPr>
+                <w:rFonts w:ascii="BRH Devanagari Extra" w:hAnsi="BRH Devanagari Extra" w:cs="BRH Devanagari Extra"/>
+                <w:color w:val="000000"/>
+                <w:sz w:val="40"/>
+                <w:szCs w:val="40"/>
+              </w:rPr>
+              <w:t>qÉ</w:t>
             </w:r>
             <w:r>
               <w:rPr>
@@ -395,6 +1124,7 @@
               </w:rPr>
               <w:t>Så</w:t>
             </w:r>
+            <w:proofErr w:type="spellEnd"/>
             <w:r>
               <w:rPr>
                 <w:rFonts w:ascii="BRH Malayalam Extra" w:hAnsi="BRH Malayalam Extra" w:cs="BRH Devanagari Extra"/>
@@ -435,6 +1165,7 @@
                 <w:lang w:val="it-IT"/>
               </w:rPr>
             </w:pPr>
+            <w:proofErr w:type="spellStart"/>
             <w:r>
               <w:rPr>
                 <w:rFonts w:ascii="BRH Devanagari Extra" w:hAnsi="BRH Devanagari Extra" w:cs="BRH Devanagari Extra"/>
@@ -444,16 +1175,18 @@
               </w:rPr>
               <w:t>qÉSå</w:t>
             </w:r>
-            <w:r>
-              <w:rPr>
-                <w:rFonts w:ascii="BRH Malayalam Extra" w:hAnsi="BRH Malayalam Extra" w:cs="BRH Devanagari Extra"/>
-                <w:b/>
-                <w:color w:val="000000"/>
-                <w:sz w:val="32"/>
-                <w:szCs w:val="40"/>
-              </w:rPr>
-              <w:t>–</w:t>
-            </w:r>
+            <w:proofErr w:type="spellEnd"/>
+            <w:r>
+              <w:rPr>
+                <w:rFonts w:ascii="BRH Malayalam Extra" w:hAnsi="BRH Malayalam Extra" w:cs="BRH Devanagari Extra"/>
+                <w:b/>
+                <w:color w:val="000000"/>
+                <w:sz w:val="32"/>
+                <w:szCs w:val="40"/>
+              </w:rPr>
+              <w:t>–</w:t>
+            </w:r>
+            <w:proofErr w:type="spellStart"/>
             <w:r>
               <w:rPr>
                 <w:rFonts w:ascii="BRH Devanagari Extra" w:hAnsi="BRH Devanagari Extra" w:cs="BRH Devanagari Extra"/>
@@ -463,24 +1196,35 @@
               </w:rPr>
               <w:t>qÉåÌiÉ</w:t>
             </w:r>
-            <w:r>
-              <w:rPr>
-                <w:rFonts w:ascii="BRH Malayalam Extra" w:hAnsi="BRH Malayalam Extra" w:cs="BRH Devanagari Extra"/>
-                <w:b/>
-                <w:color w:val="000000"/>
-                <w:sz w:val="32"/>
-                <w:szCs w:val="40"/>
-              </w:rPr>
-              <w:t>–</w:t>
-            </w:r>
-            <w:r>
-              <w:rPr>
-                <w:rFonts w:ascii="BRH Devanagari Extra" w:hAnsi="BRH Devanagari Extra" w:cs="BRH Devanagari Extra"/>
-                <w:color w:val="000000"/>
-                <w:sz w:val="40"/>
-                <w:szCs w:val="40"/>
-              </w:rPr>
-              <w:t xml:space="preserve"> qÉ</w:t>
+            <w:proofErr w:type="spellEnd"/>
+            <w:r>
+              <w:rPr>
+                <w:rFonts w:ascii="BRH Malayalam Extra" w:hAnsi="BRH Malayalam Extra" w:cs="BRH Devanagari Extra"/>
+                <w:b/>
+                <w:color w:val="000000"/>
+                <w:sz w:val="32"/>
+                <w:szCs w:val="40"/>
+              </w:rPr>
+              <w:t>–</w:t>
+            </w:r>
+            <w:r>
+              <w:rPr>
+                <w:rFonts w:ascii="BRH Devanagari Extra" w:hAnsi="BRH Devanagari Extra" w:cs="BRH Devanagari Extra"/>
+                <w:color w:val="000000"/>
+                <w:sz w:val="40"/>
+                <w:szCs w:val="40"/>
+              </w:rPr>
+              <w:t xml:space="preserve"> </w:t>
+            </w:r>
+            <w:proofErr w:type="spellStart"/>
+            <w:r>
+              <w:rPr>
+                <w:rFonts w:ascii="BRH Devanagari Extra" w:hAnsi="BRH Devanagari Extra" w:cs="BRH Devanagari Extra"/>
+                <w:color w:val="000000"/>
+                <w:sz w:val="40"/>
+                <w:szCs w:val="40"/>
+              </w:rPr>
+              <w:t>qÉ</w:t>
             </w:r>
             <w:r>
               <w:rPr>
@@ -499,7 +1243,17 @@
                 <w:sz w:val="40"/>
                 <w:szCs w:val="40"/>
               </w:rPr>
-              <w:t>þqÉ ||</w:t>
+              <w:t>þqÉ</w:t>
+            </w:r>
+            <w:proofErr w:type="spellEnd"/>
+            <w:r>
+              <w:rPr>
+                <w:rFonts w:ascii="BRH Devanagari Extra" w:hAnsi="BRH Devanagari Extra" w:cs="BRH Devanagari Extra"/>
+                <w:color w:val="000000"/>
+                <w:sz w:val="40"/>
+                <w:szCs w:val="40"/>
+              </w:rPr>
+              <w:t xml:space="preserve"> ||</w:t>
             </w:r>
           </w:p>
         </w:tc>
@@ -1036,6 +1790,7 @@
                 <w:szCs w:val="28"/>
                 <w:lang w:val="it-IT"/>
               </w:rPr>
+              <w:lastRenderedPageBreak/>
               <w:t>TS 2.4.14.1 - Kramam</w:t>
             </w:r>
           </w:p>
@@ -1591,7 +2346,6 @@
                 <w:highlight w:val="green"/>
                 <w:lang w:val="it-IT"/>
               </w:rPr>
-              <w:lastRenderedPageBreak/>
               <w:t>ÌmÉ</w:t>
             </w:r>
             <w:r>
@@ -1669,7 +2423,6 @@
           <w:szCs w:val="32"/>
           <w:u w:val="single"/>
         </w:rPr>
-        <w:lastRenderedPageBreak/>
         <w:t>================</w:t>
       </w:r>
     </w:p>
@@ -2256,6 +3009,7 @@
                 <w:sz w:val="28"/>
                 <w:szCs w:val="32"/>
               </w:rPr>
+              <w:lastRenderedPageBreak/>
               <w:t>T.S.2.</w:t>
             </w:r>
             <w:r>
@@ -2392,6 +3146,7 @@
                 <w:szCs w:val="40"/>
               </w:rPr>
             </w:pPr>
+            <w:proofErr w:type="spellStart"/>
             <w:r>
               <w:rPr>
                 <w:rFonts w:ascii="BRH Devanagari Extra" w:hAnsi="BRH Devanagari Extra" w:cs="BRH Devanagari Extra"/>
@@ -2401,6 +3156,7 @@
               </w:rPr>
               <w:t>iÉÉÌlÉ</w:t>
             </w:r>
+            <w:proofErr w:type="spellEnd"/>
             <w:r>
               <w:rPr>
                 <w:rFonts w:ascii="BRH Malayalam Extra" w:hAnsi="BRH Malayalam Extra" w:cs="BRH Devanagari Extra"/>
@@ -2418,7 +3174,17 @@
                 <w:sz w:val="40"/>
                 <w:szCs w:val="40"/>
               </w:rPr>
-              <w:t xml:space="preserve"> U¤ÉÉ</w:t>
+              <w:t xml:space="preserve"> </w:t>
+            </w:r>
+            <w:proofErr w:type="spellStart"/>
+            <w:r>
+              <w:rPr>
+                <w:rFonts w:ascii="BRH Devanagari Extra" w:hAnsi="BRH Devanagari Extra" w:cs="BRH Devanagari Extra"/>
+                <w:color w:val="000000"/>
+                <w:sz w:val="40"/>
+                <w:szCs w:val="40"/>
+              </w:rPr>
+              <w:t>U¤ÉÉ</w:t>
             </w:r>
             <w:r>
               <w:rPr>
@@ -2436,7 +3202,17 @@
                 <w:sz w:val="40"/>
                 <w:szCs w:val="40"/>
               </w:rPr>
-              <w:t xml:space="preserve">þÍxÉ | </w:t>
+              <w:t>þÍxÉ</w:t>
+            </w:r>
+            <w:proofErr w:type="spellEnd"/>
+            <w:r>
+              <w:rPr>
+                <w:rFonts w:ascii="BRH Devanagari Extra" w:hAnsi="BRH Devanagari Extra" w:cs="BRH Devanagari Extra"/>
+                <w:color w:val="000000"/>
+                <w:sz w:val="40"/>
+                <w:szCs w:val="40"/>
+              </w:rPr>
+              <w:t xml:space="preserve"> | </w:t>
             </w:r>
           </w:p>
           <w:p>
@@ -2497,14 +3273,25 @@
               </w:rPr>
               <w:t>–</w:t>
             </w:r>
-            <w:r>
-              <w:rPr>
-                <w:rFonts w:ascii="BRH Devanagari Extra" w:hAnsi="BRH Devanagari Extra" w:cs="BRH Devanagari Extra"/>
-                <w:color w:val="000000"/>
-                <w:sz w:val="40"/>
-                <w:szCs w:val="40"/>
-              </w:rPr>
-              <w:t>xrÉlÉ×þiÉqÉç |</w:t>
+            <w:proofErr w:type="spellStart"/>
+            <w:r>
+              <w:rPr>
+                <w:rFonts w:ascii="BRH Devanagari Extra" w:hAnsi="BRH Devanagari Extra" w:cs="BRH Devanagari Extra"/>
+                <w:color w:val="000000"/>
+                <w:sz w:val="40"/>
+                <w:szCs w:val="40"/>
+              </w:rPr>
+              <w:t>xrÉlÉ×þiÉqÉç</w:t>
+            </w:r>
+            <w:proofErr w:type="spellEnd"/>
+            <w:r>
+              <w:rPr>
+                <w:rFonts w:ascii="BRH Devanagari Extra" w:hAnsi="BRH Devanagari Extra" w:cs="BRH Devanagari Extra"/>
+                <w:color w:val="000000"/>
+                <w:sz w:val="40"/>
+                <w:szCs w:val="40"/>
+              </w:rPr>
+              <w:t xml:space="preserve"> |</w:t>
             </w:r>
           </w:p>
         </w:tc>
@@ -2522,6 +3309,7 @@
                 <w:szCs w:val="40"/>
               </w:rPr>
             </w:pPr>
+            <w:proofErr w:type="spellStart"/>
             <w:r>
               <w:rPr>
                 <w:rFonts w:ascii="BRH Devanagari Extra" w:hAnsi="BRH Devanagari Extra" w:cs="BRH Devanagari Extra"/>
@@ -2531,6 +3319,7 @@
               </w:rPr>
               <w:t>iÉÉÌlÉ</w:t>
             </w:r>
+            <w:proofErr w:type="spellEnd"/>
             <w:r>
               <w:rPr>
                 <w:rFonts w:ascii="BRH Malayalam Extra" w:hAnsi="BRH Malayalam Extra" w:cs="BRH Devanagari Extra"/>
@@ -2548,7 +3337,17 @@
                 <w:sz w:val="40"/>
                 <w:szCs w:val="40"/>
               </w:rPr>
-              <w:t xml:space="preserve"> U¤ÉÉ</w:t>
+              <w:t xml:space="preserve"> </w:t>
+            </w:r>
+            <w:proofErr w:type="spellStart"/>
+            <w:r>
+              <w:rPr>
+                <w:rFonts w:ascii="BRH Devanagari Extra" w:hAnsi="BRH Devanagari Extra" w:cs="BRH Devanagari Extra"/>
+                <w:color w:val="000000"/>
+                <w:sz w:val="40"/>
+                <w:szCs w:val="40"/>
+              </w:rPr>
+              <w:t>U¤ÉÉ</w:t>
             </w:r>
             <w:r>
               <w:rPr>
@@ -2566,7 +3365,17 @@
                 <w:sz w:val="40"/>
                 <w:szCs w:val="40"/>
               </w:rPr>
-              <w:t xml:space="preserve">þÍxÉ | </w:t>
+              <w:t>þÍxÉ</w:t>
+            </w:r>
+            <w:proofErr w:type="spellEnd"/>
+            <w:r>
+              <w:rPr>
+                <w:rFonts w:ascii="BRH Devanagari Extra" w:hAnsi="BRH Devanagari Extra" w:cs="BRH Devanagari Extra"/>
+                <w:color w:val="000000"/>
+                <w:sz w:val="40"/>
+                <w:szCs w:val="40"/>
+              </w:rPr>
+              <w:t xml:space="preserve"> | </w:t>
             </w:r>
           </w:p>
           <w:p>
@@ -2621,14 +3430,25 @@
               </w:rPr>
               <w:t>–</w:t>
             </w:r>
-            <w:r>
-              <w:rPr>
-                <w:rFonts w:ascii="BRH Devanagari Extra" w:hAnsi="BRH Devanagari Extra" w:cs="BRH Devanagari Extra"/>
-                <w:color w:val="000000"/>
-                <w:sz w:val="40"/>
-                <w:szCs w:val="40"/>
-              </w:rPr>
-              <w:t>xrÉlÉ×þiÉqÉç |</w:t>
+            <w:proofErr w:type="spellStart"/>
+            <w:r>
+              <w:rPr>
+                <w:rFonts w:ascii="BRH Devanagari Extra" w:hAnsi="BRH Devanagari Extra" w:cs="BRH Devanagari Extra"/>
+                <w:color w:val="000000"/>
+                <w:sz w:val="40"/>
+                <w:szCs w:val="40"/>
+              </w:rPr>
+              <w:t>xrÉlÉ×þiÉqÉç</w:t>
+            </w:r>
+            <w:proofErr w:type="spellEnd"/>
+            <w:r>
+              <w:rPr>
+                <w:rFonts w:ascii="BRH Devanagari Extra" w:hAnsi="BRH Devanagari Extra" w:cs="BRH Devanagari Extra"/>
+                <w:color w:val="000000"/>
+                <w:sz w:val="40"/>
+                <w:szCs w:val="40"/>
+              </w:rPr>
+              <w:t xml:space="preserve"> |</w:t>
             </w:r>
           </w:p>
         </w:tc>
@@ -2801,25 +3621,37 @@
                 <w:szCs w:val="40"/>
               </w:rPr>
             </w:pPr>
-            <w:r>
-              <w:rPr>
-                <w:rFonts w:ascii="BRH Devanagari Extra" w:hAnsi="BRH Devanagari Extra" w:cs="BRH Devanagari Extra"/>
-                <w:color w:val="000000"/>
-                <w:sz w:val="40"/>
-                <w:szCs w:val="40"/>
-              </w:rPr>
-              <w:t>CirÉþoÉëuÉÏiÉç | A</w:t>
-            </w:r>
-            <w:r>
-              <w:rPr>
-                <w:rFonts w:ascii="BRH Malayalam Extra" w:hAnsi="BRH Malayalam Extra" w:cs="BRH Devanagari Extra"/>
-                <w:b/>
-                <w:color w:val="000000"/>
-                <w:sz w:val="32"/>
-                <w:szCs w:val="40"/>
-              </w:rPr>
-              <w:t>–</w:t>
-            </w:r>
+            <w:proofErr w:type="spellStart"/>
+            <w:r>
+              <w:rPr>
+                <w:rFonts w:ascii="BRH Devanagari Extra" w:hAnsi="BRH Devanagari Extra" w:cs="BRH Devanagari Extra"/>
+                <w:color w:val="000000"/>
+                <w:sz w:val="40"/>
+                <w:szCs w:val="40"/>
+              </w:rPr>
+              <w:t>CirÉþoÉëuÉÏiÉç</w:t>
+            </w:r>
+            <w:proofErr w:type="spellEnd"/>
+            <w:r>
+              <w:rPr>
+                <w:rFonts w:ascii="BRH Devanagari Extra" w:hAnsi="BRH Devanagari Extra" w:cs="BRH Devanagari Extra"/>
+                <w:color w:val="000000"/>
+                <w:sz w:val="40"/>
+                <w:szCs w:val="40"/>
+              </w:rPr>
+              <w:t xml:space="preserve"> | A</w:t>
+            </w:r>
+            <w:r>
+              <w:rPr>
+                <w:rFonts w:ascii="BRH Malayalam Extra" w:hAnsi="BRH Malayalam Extra" w:cs="BRH Devanagari Extra"/>
+                <w:b/>
+                <w:color w:val="000000"/>
+                <w:sz w:val="32"/>
+                <w:szCs w:val="40"/>
+              </w:rPr>
+              <w:t>–</w:t>
+            </w:r>
+            <w:proofErr w:type="spellStart"/>
             <w:r>
               <w:rPr>
                 <w:rFonts w:ascii="BRH Devanagari Extra" w:hAnsi="BRH Devanagari Extra" w:cs="BRH Devanagari Extra"/>
@@ -2829,6 +3661,7 @@
               </w:rPr>
               <w:t>oÉë</w:t>
             </w:r>
+            <w:proofErr w:type="spellEnd"/>
             <w:r>
               <w:rPr>
                 <w:rFonts w:ascii="BRH Malayalam Extra" w:hAnsi="BRH Malayalam Extra" w:cs="BRH Devanagari Extra"/>
@@ -2839,6 +3672,7 @@
               </w:rPr>
               <w:t>––</w:t>
             </w:r>
+            <w:proofErr w:type="spellStart"/>
             <w:r>
               <w:rPr>
                 <w:rFonts w:ascii="BRH Devanagari Extra" w:hAnsi="BRH Devanagari Extra" w:cs="BRH Devanagari Extra"/>
@@ -2856,7 +3690,37 @@
                 <w:sz w:val="40"/>
                 <w:szCs w:val="40"/>
               </w:rPr>
-              <w:t>iÉç iÉå |</w:t>
+              <w:t>iÉç</w:t>
+            </w:r>
+            <w:proofErr w:type="spellEnd"/>
+            <w:r>
+              <w:rPr>
+                <w:rFonts w:ascii="BRH Devanagari Extra" w:hAnsi="BRH Devanagari Extra" w:cs="BRH Devanagari Extra"/>
+                <w:color w:val="000000"/>
+                <w:sz w:val="40"/>
+                <w:szCs w:val="40"/>
+              </w:rPr>
+              <w:t xml:space="preserve"> </w:t>
+            </w:r>
+            <w:proofErr w:type="spellStart"/>
+            <w:r>
+              <w:rPr>
+                <w:rFonts w:ascii="BRH Devanagari Extra" w:hAnsi="BRH Devanagari Extra" w:cs="BRH Devanagari Extra"/>
+                <w:color w:val="000000"/>
+                <w:sz w:val="40"/>
+                <w:szCs w:val="40"/>
+              </w:rPr>
+              <w:t>iÉå</w:t>
+            </w:r>
+            <w:proofErr w:type="spellEnd"/>
+            <w:r>
+              <w:rPr>
+                <w:rFonts w:ascii="BRH Devanagari Extra" w:hAnsi="BRH Devanagari Extra" w:cs="BRH Devanagari Extra"/>
+                <w:color w:val="000000"/>
+                <w:sz w:val="40"/>
+                <w:szCs w:val="40"/>
+              </w:rPr>
+              <w:t xml:space="preserve"> |</w:t>
             </w:r>
           </w:p>
         </w:tc>
@@ -2878,25 +3742,37 @@
                 <w:szCs w:val="40"/>
               </w:rPr>
             </w:pPr>
-            <w:r>
-              <w:rPr>
-                <w:rFonts w:ascii="BRH Devanagari Extra" w:hAnsi="BRH Devanagari Extra" w:cs="BRH Devanagari Extra"/>
-                <w:color w:val="000000"/>
-                <w:sz w:val="40"/>
-                <w:szCs w:val="40"/>
-              </w:rPr>
-              <w:t>CirÉþoÉëuÉÏiÉç | A</w:t>
-            </w:r>
-            <w:r>
-              <w:rPr>
-                <w:rFonts w:ascii="BRH Malayalam Extra" w:hAnsi="BRH Malayalam Extra" w:cs="BRH Devanagari Extra"/>
-                <w:b/>
-                <w:color w:val="000000"/>
-                <w:sz w:val="32"/>
-                <w:szCs w:val="40"/>
-              </w:rPr>
-              <w:t>–</w:t>
-            </w:r>
+            <w:proofErr w:type="spellStart"/>
+            <w:r>
+              <w:rPr>
+                <w:rFonts w:ascii="BRH Devanagari Extra" w:hAnsi="BRH Devanagari Extra" w:cs="BRH Devanagari Extra"/>
+                <w:color w:val="000000"/>
+                <w:sz w:val="40"/>
+                <w:szCs w:val="40"/>
+              </w:rPr>
+              <w:t>CirÉþoÉëuÉÏiÉç</w:t>
+            </w:r>
+            <w:proofErr w:type="spellEnd"/>
+            <w:r>
+              <w:rPr>
+                <w:rFonts w:ascii="BRH Devanagari Extra" w:hAnsi="BRH Devanagari Extra" w:cs="BRH Devanagari Extra"/>
+                <w:color w:val="000000"/>
+                <w:sz w:val="40"/>
+                <w:szCs w:val="40"/>
+              </w:rPr>
+              <w:t xml:space="preserve"> | A</w:t>
+            </w:r>
+            <w:r>
+              <w:rPr>
+                <w:rFonts w:ascii="BRH Malayalam Extra" w:hAnsi="BRH Malayalam Extra" w:cs="BRH Devanagari Extra"/>
+                <w:b/>
+                <w:color w:val="000000"/>
+                <w:sz w:val="32"/>
+                <w:szCs w:val="40"/>
+              </w:rPr>
+              <w:t>–</w:t>
+            </w:r>
+            <w:proofErr w:type="spellStart"/>
             <w:r>
               <w:rPr>
                 <w:rFonts w:ascii="BRH Devanagari Extra" w:hAnsi="BRH Devanagari Extra" w:cs="BRH Devanagari Extra"/>
@@ -2906,6 +3782,7 @@
               </w:rPr>
               <w:t>oÉë</w:t>
             </w:r>
+            <w:proofErr w:type="spellEnd"/>
             <w:r>
               <w:rPr>
                 <w:rFonts w:ascii="BRH Malayalam Extra" w:hAnsi="BRH Malayalam Extra" w:cs="BRH Devanagari Extra"/>
@@ -2916,6 +3793,7 @@
               </w:rPr>
               <w:t>––</w:t>
             </w:r>
+            <w:proofErr w:type="spellStart"/>
             <w:r>
               <w:rPr>
                 <w:rFonts w:ascii="BRH Devanagari Extra" w:hAnsi="BRH Devanagari Extra" w:cs="BRH Devanagari Extra"/>
@@ -2926,24 +3804,45 @@
               </w:rPr>
               <w:t>uÉÏ</w:t>
             </w:r>
-            <w:r>
-              <w:rPr>
-                <w:rFonts w:ascii="BRH Malayalam Extra" w:hAnsi="BRH Malayalam Extra" w:cs="BRH Devanagari Extra"/>
-                <w:b/>
-                <w:color w:val="000000"/>
-                <w:sz w:val="32"/>
-                <w:szCs w:val="40"/>
-              </w:rPr>
-              <w:t>–</w:t>
-            </w:r>
-            <w:r>
-              <w:rPr>
-                <w:rFonts w:ascii="BRH Devanagari Extra" w:hAnsi="BRH Devanagari Extra" w:cs="BRH Devanagari Extra"/>
-                <w:color w:val="000000"/>
-                <w:sz w:val="40"/>
-                <w:szCs w:val="40"/>
-              </w:rPr>
-              <w:t>iÉç iÉå |</w:t>
+            <w:proofErr w:type="spellEnd"/>
+            <w:r>
+              <w:rPr>
+                <w:rFonts w:ascii="BRH Malayalam Extra" w:hAnsi="BRH Malayalam Extra" w:cs="BRH Devanagari Extra"/>
+                <w:b/>
+                <w:color w:val="000000"/>
+                <w:sz w:val="32"/>
+                <w:szCs w:val="40"/>
+              </w:rPr>
+              <w:t>–</w:t>
+            </w:r>
+            <w:r>
+              <w:rPr>
+                <w:rFonts w:ascii="BRH Devanagari Extra" w:hAnsi="BRH Devanagari Extra" w:cs="BRH Devanagari Extra"/>
+                <w:color w:val="000000"/>
+                <w:sz w:val="40"/>
+                <w:szCs w:val="40"/>
+              </w:rPr>
+              <w:t xml:space="preserve">iÉç </w:t>
+            </w:r>
+            <w:proofErr w:type="spellStart"/>
+            <w:r>
+              <w:rPr>
+                <w:rFonts w:ascii="BRH Devanagari Extra" w:hAnsi="BRH Devanagari Extra" w:cs="BRH Devanagari Extra"/>
+                <w:color w:val="000000"/>
+                <w:sz w:val="40"/>
+                <w:szCs w:val="40"/>
+              </w:rPr>
+              <w:t>iÉå</w:t>
+            </w:r>
+            <w:proofErr w:type="spellEnd"/>
+            <w:r>
+              <w:rPr>
+                <w:rFonts w:ascii="BRH Devanagari Extra" w:hAnsi="BRH Devanagari Extra" w:cs="BRH Devanagari Extra"/>
+                <w:color w:val="000000"/>
+                <w:sz w:val="40"/>
+                <w:szCs w:val="40"/>
+              </w:rPr>
+              <w:t xml:space="preserve"> |</w:t>
             </w:r>
           </w:p>
         </w:tc>
@@ -2980,7 +3879,6 @@
                 <w:sz w:val="28"/>
                 <w:szCs w:val="32"/>
               </w:rPr>
-              <w:lastRenderedPageBreak/>
               <w:t>T.S.2.</w:t>
             </w:r>
             <w:r>
@@ -3168,16 +4066,37 @@
                 <w:szCs w:val="40"/>
                 <w:highlight w:val="yellow"/>
               </w:rPr>
-              <w:t>¢ü</w:t>
-            </w:r>
-            <w:r>
-              <w:rPr>
-                <w:rFonts w:ascii="BRH Devanagari Extra" w:hAnsi="BRH Devanagari Extra" w:cs="BRH Devanagari Extra"/>
-                <w:color w:val="000000"/>
-                <w:sz w:val="40"/>
-                <w:szCs w:val="40"/>
-              </w:rPr>
-              <w:t xml:space="preserve">þqrÉÉÌiÉ¸iÉç | </w:t>
+              <w:t>¢</w:t>
+            </w:r>
+            <w:proofErr w:type="spellStart"/>
+            <w:r>
+              <w:rPr>
+                <w:rFonts w:ascii="BRH Devanagari Extra" w:hAnsi="BRH Devanagari Extra" w:cs="BRH Devanagari Extra"/>
+                <w:color w:val="000000"/>
+                <w:sz w:val="40"/>
+                <w:szCs w:val="40"/>
+                <w:highlight w:val="yellow"/>
+              </w:rPr>
+              <w:t>ü</w:t>
+            </w:r>
+            <w:r>
+              <w:rPr>
+                <w:rFonts w:ascii="BRH Devanagari Extra" w:hAnsi="BRH Devanagari Extra" w:cs="BRH Devanagari Extra"/>
+                <w:color w:val="000000"/>
+                <w:sz w:val="40"/>
+                <w:szCs w:val="40"/>
+              </w:rPr>
+              <w:t>þqrÉÉÌiÉ¸iÉç</w:t>
+            </w:r>
+            <w:proofErr w:type="spellEnd"/>
+            <w:r>
+              <w:rPr>
+                <w:rFonts w:ascii="BRH Devanagari Extra" w:hAnsi="BRH Devanagari Extra" w:cs="BRH Devanagari Extra"/>
+                <w:color w:val="000000"/>
+                <w:sz w:val="40"/>
+                <w:szCs w:val="40"/>
+              </w:rPr>
+              <w:t xml:space="preserve"> | </w:t>
             </w:r>
           </w:p>
           <w:p>
@@ -3235,7 +4154,47 @@
                 <w:sz w:val="40"/>
                 <w:szCs w:val="40"/>
               </w:rPr>
-              <w:t>¢üqrÉåirÉþmÉ - ¢üqrÉþ |</w:t>
+              <w:t>¢</w:t>
+            </w:r>
+            <w:proofErr w:type="spellStart"/>
+            <w:r>
+              <w:rPr>
+                <w:rFonts w:ascii="BRH Devanagari Extra" w:hAnsi="BRH Devanagari Extra" w:cs="BRH Devanagari Extra"/>
+                <w:color w:val="000000"/>
+                <w:sz w:val="40"/>
+                <w:szCs w:val="40"/>
+              </w:rPr>
+              <w:t>üqrÉåirÉþmÉ</w:t>
+            </w:r>
+            <w:proofErr w:type="spellEnd"/>
+            <w:r>
+              <w:rPr>
+                <w:rFonts w:ascii="BRH Devanagari Extra" w:hAnsi="BRH Devanagari Extra" w:cs="BRH Devanagari Extra"/>
+                <w:color w:val="000000"/>
+                <w:sz w:val="40"/>
+                <w:szCs w:val="40"/>
+              </w:rPr>
+              <w:t xml:space="preserve"> - ¢</w:t>
+            </w:r>
+            <w:proofErr w:type="spellStart"/>
+            <w:r>
+              <w:rPr>
+                <w:rFonts w:ascii="BRH Devanagari Extra" w:hAnsi="BRH Devanagari Extra" w:cs="BRH Devanagari Extra"/>
+                <w:color w:val="000000"/>
+                <w:sz w:val="40"/>
+                <w:szCs w:val="40"/>
+              </w:rPr>
+              <w:t>üqrÉþ</w:t>
+            </w:r>
+            <w:proofErr w:type="spellEnd"/>
+            <w:r>
+              <w:rPr>
+                <w:rFonts w:ascii="BRH Devanagari Extra" w:hAnsi="BRH Devanagari Extra" w:cs="BRH Devanagari Extra"/>
+                <w:color w:val="000000"/>
+                <w:sz w:val="40"/>
+                <w:szCs w:val="40"/>
+              </w:rPr>
+              <w:t xml:space="preserve"> |</w:t>
             </w:r>
           </w:p>
         </w:tc>
@@ -3302,7 +4261,17 @@
                 <w:sz w:val="40"/>
                 <w:szCs w:val="40"/>
               </w:rPr>
-              <w:t>¢ü</w:t>
+              <w:t>¢</w:t>
+            </w:r>
+            <w:proofErr w:type="spellStart"/>
+            <w:r>
+              <w:rPr>
+                <w:rFonts w:ascii="BRH Devanagari Extra" w:hAnsi="BRH Devanagari Extra" w:cs="BRH Devanagari Extra"/>
+                <w:color w:val="000000"/>
+                <w:sz w:val="40"/>
+                <w:szCs w:val="40"/>
+              </w:rPr>
+              <w:t>ü</w:t>
             </w:r>
             <w:r>
               <w:rPr>
@@ -3321,7 +4290,17 @@
                 <w:sz w:val="40"/>
                 <w:szCs w:val="40"/>
               </w:rPr>
-              <w:t xml:space="preserve">þÌiÉ¸iÉç | </w:t>
+              <w:t>þÌiÉ¸iÉç</w:t>
+            </w:r>
+            <w:proofErr w:type="spellEnd"/>
+            <w:r>
+              <w:rPr>
+                <w:rFonts w:ascii="BRH Devanagari Extra" w:hAnsi="BRH Devanagari Extra" w:cs="BRH Devanagari Extra"/>
+                <w:color w:val="000000"/>
+                <w:sz w:val="40"/>
+                <w:szCs w:val="40"/>
+              </w:rPr>
+              <w:t xml:space="preserve"> | </w:t>
             </w:r>
           </w:p>
           <w:p>
@@ -3383,7 +4362,47 @@
                 <w:sz w:val="40"/>
                 <w:szCs w:val="40"/>
               </w:rPr>
-              <w:t>¢üqrÉåirÉþmÉ - ¢üqrÉþ |</w:t>
+              <w:t>¢</w:t>
+            </w:r>
+            <w:proofErr w:type="spellStart"/>
+            <w:r>
+              <w:rPr>
+                <w:rFonts w:ascii="BRH Devanagari Extra" w:hAnsi="BRH Devanagari Extra" w:cs="BRH Devanagari Extra"/>
+                <w:color w:val="000000"/>
+                <w:sz w:val="40"/>
+                <w:szCs w:val="40"/>
+              </w:rPr>
+              <w:t>üqrÉåirÉþmÉ</w:t>
+            </w:r>
+            <w:proofErr w:type="spellEnd"/>
+            <w:r>
+              <w:rPr>
+                <w:rFonts w:ascii="BRH Devanagari Extra" w:hAnsi="BRH Devanagari Extra" w:cs="BRH Devanagari Extra"/>
+                <w:color w:val="000000"/>
+                <w:sz w:val="40"/>
+                <w:szCs w:val="40"/>
+              </w:rPr>
+              <w:t xml:space="preserve"> - ¢</w:t>
+            </w:r>
+            <w:proofErr w:type="spellStart"/>
+            <w:r>
+              <w:rPr>
+                <w:rFonts w:ascii="BRH Devanagari Extra" w:hAnsi="BRH Devanagari Extra" w:cs="BRH Devanagari Extra"/>
+                <w:color w:val="000000"/>
+                <w:sz w:val="40"/>
+                <w:szCs w:val="40"/>
+              </w:rPr>
+              <w:t>üqrÉþ</w:t>
+            </w:r>
+            <w:proofErr w:type="spellEnd"/>
+            <w:r>
+              <w:rPr>
+                <w:rFonts w:ascii="BRH Devanagari Extra" w:hAnsi="BRH Devanagari Extra" w:cs="BRH Devanagari Extra"/>
+                <w:color w:val="000000"/>
+                <w:sz w:val="40"/>
+                <w:szCs w:val="40"/>
+              </w:rPr>
+              <w:t xml:space="preserve"> |</w:t>
             </w:r>
           </w:p>
         </w:tc>
@@ -3556,14 +4575,25 @@
                 <w:szCs w:val="40"/>
               </w:rPr>
             </w:pPr>
-            <w:r>
-              <w:rPr>
-                <w:rFonts w:ascii="BRH Devanagari Extra" w:hAnsi="BRH Devanagari Extra" w:cs="BRH Devanagari Extra"/>
-                <w:color w:val="000000"/>
-                <w:sz w:val="40"/>
-                <w:szCs w:val="40"/>
-              </w:rPr>
-              <w:t xml:space="preserve">ÍqÉ§ÉÉþuÉÂhÉÉ ÅrÉïqÉ³Éç | </w:t>
+            <w:proofErr w:type="spellStart"/>
+            <w:r>
+              <w:rPr>
+                <w:rFonts w:ascii="BRH Devanagari Extra" w:hAnsi="BRH Devanagari Extra" w:cs="BRH Devanagari Extra"/>
+                <w:color w:val="000000"/>
+                <w:sz w:val="40"/>
+                <w:szCs w:val="40"/>
+              </w:rPr>
+              <w:t>ÍqÉ§ÉÉþuÉÂhÉÉ</w:t>
+            </w:r>
+            <w:proofErr w:type="spellEnd"/>
+            <w:r>
+              <w:rPr>
+                <w:rFonts w:ascii="BRH Devanagari Extra" w:hAnsi="BRH Devanagari Extra" w:cs="BRH Devanagari Extra"/>
+                <w:color w:val="000000"/>
+                <w:sz w:val="40"/>
+                <w:szCs w:val="40"/>
+              </w:rPr>
+              <w:t xml:space="preserve"> ÅrÉïqÉ³Éç | </w:t>
             </w:r>
           </w:p>
           <w:p>
@@ -3576,6 +4606,7 @@
                 <w:szCs w:val="40"/>
               </w:rPr>
             </w:pPr>
+            <w:proofErr w:type="spellStart"/>
             <w:r>
               <w:rPr>
                 <w:rFonts w:ascii="BRH Devanagari Extra" w:hAnsi="BRH Devanagari Extra" w:cs="BRH Devanagari Extra"/>
@@ -3585,16 +4616,18 @@
               </w:rPr>
               <w:t>ÍqÉ§ÉÉþuÉÂ</w:t>
             </w:r>
-            <w:r>
-              <w:rPr>
-                <w:rFonts w:ascii="BRH Malayalam Extra" w:hAnsi="BRH Malayalam Extra" w:cs="BRH Devanagari Extra"/>
-                <w:b/>
-                <w:color w:val="000000"/>
-                <w:sz w:val="32"/>
-                <w:szCs w:val="40"/>
-              </w:rPr>
-              <w:t>–</w:t>
-            </w:r>
+            <w:proofErr w:type="spellEnd"/>
+            <w:r>
+              <w:rPr>
+                <w:rFonts w:ascii="BRH Malayalam Extra" w:hAnsi="BRH Malayalam Extra" w:cs="BRH Devanagari Extra"/>
+                <w:b/>
+                <w:color w:val="000000"/>
+                <w:sz w:val="32"/>
+                <w:szCs w:val="40"/>
+              </w:rPr>
+              <w:t>–</w:t>
+            </w:r>
+            <w:proofErr w:type="spellStart"/>
             <w:r>
               <w:rPr>
                 <w:rFonts w:ascii="BRH Devanagari Extra" w:hAnsi="BRH Devanagari Extra" w:cs="BRH Devanagari Extra"/>
@@ -3604,24 +4637,45 @@
               </w:rPr>
               <w:t>hÉåÌiÉ</w:t>
             </w:r>
-            <w:r>
-              <w:rPr>
-                <w:rFonts w:ascii="BRH Malayalam Extra" w:hAnsi="BRH Malayalam Extra" w:cs="BRH Devanagari Extra"/>
-                <w:b/>
-                <w:color w:val="000000"/>
-                <w:sz w:val="32"/>
-                <w:szCs w:val="40"/>
-              </w:rPr>
-              <w:t>–</w:t>
-            </w:r>
-            <w:r>
-              <w:rPr>
-                <w:rFonts w:ascii="BRH Devanagari Extra" w:hAnsi="BRH Devanagari Extra" w:cs="BRH Devanagari Extra"/>
-                <w:color w:val="000000"/>
-                <w:sz w:val="40"/>
-                <w:szCs w:val="40"/>
-              </w:rPr>
-              <w:t xml:space="preserve"> ÍqÉ§ÉÉÿ - uÉ</w:t>
+            <w:proofErr w:type="spellEnd"/>
+            <w:r>
+              <w:rPr>
+                <w:rFonts w:ascii="BRH Malayalam Extra" w:hAnsi="BRH Malayalam Extra" w:cs="BRH Devanagari Extra"/>
+                <w:b/>
+                <w:color w:val="000000"/>
+                <w:sz w:val="32"/>
+                <w:szCs w:val="40"/>
+              </w:rPr>
+              <w:t>–</w:t>
+            </w:r>
+            <w:r>
+              <w:rPr>
+                <w:rFonts w:ascii="BRH Devanagari Extra" w:hAnsi="BRH Devanagari Extra" w:cs="BRH Devanagari Extra"/>
+                <w:color w:val="000000"/>
+                <w:sz w:val="40"/>
+                <w:szCs w:val="40"/>
+              </w:rPr>
+              <w:t xml:space="preserve"> </w:t>
+            </w:r>
+            <w:proofErr w:type="spellStart"/>
+            <w:r>
+              <w:rPr>
+                <w:rFonts w:ascii="BRH Devanagari Extra" w:hAnsi="BRH Devanagari Extra" w:cs="BRH Devanagari Extra"/>
+                <w:color w:val="000000"/>
+                <w:sz w:val="40"/>
+                <w:szCs w:val="40"/>
+              </w:rPr>
+              <w:t>ÍqÉ§ÉÉÿ</w:t>
+            </w:r>
+            <w:proofErr w:type="spellEnd"/>
+            <w:r>
+              <w:rPr>
+                <w:rFonts w:ascii="BRH Devanagari Extra" w:hAnsi="BRH Devanagari Extra" w:cs="BRH Devanagari Extra"/>
+                <w:color w:val="000000"/>
+                <w:sz w:val="40"/>
+                <w:szCs w:val="40"/>
+              </w:rPr>
+              <w:t xml:space="preserve"> - uÉ</w:t>
             </w:r>
             <w:r>
               <w:rPr>
@@ -3698,14 +4752,25 @@
                 <w:szCs w:val="40"/>
               </w:rPr>
             </w:pPr>
-            <w:r>
-              <w:rPr>
-                <w:rFonts w:ascii="BRH Devanagari Extra" w:hAnsi="BRH Devanagari Extra" w:cs="BRH Devanagari Extra"/>
-                <w:color w:val="000000"/>
-                <w:sz w:val="40"/>
-                <w:szCs w:val="40"/>
-              </w:rPr>
-              <w:t xml:space="preserve">ÍqÉ§ÉÉþuÉÂhÉÉ ÅrÉïqÉ³Éç | </w:t>
+            <w:proofErr w:type="spellStart"/>
+            <w:r>
+              <w:rPr>
+                <w:rFonts w:ascii="BRH Devanagari Extra" w:hAnsi="BRH Devanagari Extra" w:cs="BRH Devanagari Extra"/>
+                <w:color w:val="000000"/>
+                <w:sz w:val="40"/>
+                <w:szCs w:val="40"/>
+              </w:rPr>
+              <w:t>ÍqÉ§ÉÉþuÉÂhÉÉ</w:t>
+            </w:r>
+            <w:proofErr w:type="spellEnd"/>
+            <w:r>
+              <w:rPr>
+                <w:rFonts w:ascii="BRH Devanagari Extra" w:hAnsi="BRH Devanagari Extra" w:cs="BRH Devanagari Extra"/>
+                <w:color w:val="000000"/>
+                <w:sz w:val="40"/>
+                <w:szCs w:val="40"/>
+              </w:rPr>
+              <w:t xml:space="preserve"> ÅrÉïqÉ³Éç | </w:t>
             </w:r>
           </w:p>
           <w:p>
@@ -3722,6 +4787,7 @@
                 <w:szCs w:val="40"/>
               </w:rPr>
             </w:pPr>
+            <w:proofErr w:type="spellStart"/>
             <w:r>
               <w:rPr>
                 <w:rFonts w:ascii="BRH Devanagari Extra" w:hAnsi="BRH Devanagari Extra" w:cs="BRH Devanagari Extra"/>
@@ -3731,16 +4797,18 @@
               </w:rPr>
               <w:t>ÍqÉ§ÉÉþuÉÂ</w:t>
             </w:r>
-            <w:r>
-              <w:rPr>
-                <w:rFonts w:ascii="BRH Malayalam Extra" w:hAnsi="BRH Malayalam Extra" w:cs="BRH Devanagari Extra"/>
-                <w:b/>
-                <w:color w:val="000000"/>
-                <w:sz w:val="32"/>
-                <w:szCs w:val="40"/>
-              </w:rPr>
-              <w:t>–</w:t>
-            </w:r>
+            <w:proofErr w:type="spellEnd"/>
+            <w:r>
+              <w:rPr>
+                <w:rFonts w:ascii="BRH Malayalam Extra" w:hAnsi="BRH Malayalam Extra" w:cs="BRH Devanagari Extra"/>
+                <w:b/>
+                <w:color w:val="000000"/>
+                <w:sz w:val="32"/>
+                <w:szCs w:val="40"/>
+              </w:rPr>
+              <w:t>–</w:t>
+            </w:r>
+            <w:proofErr w:type="spellStart"/>
             <w:r>
               <w:rPr>
                 <w:rFonts w:ascii="BRH Devanagari Extra" w:hAnsi="BRH Devanagari Extra" w:cs="BRH Devanagari Extra"/>
@@ -3750,24 +4818,45 @@
               </w:rPr>
               <w:t>hÉåÌiÉ</w:t>
             </w:r>
-            <w:r>
-              <w:rPr>
-                <w:rFonts w:ascii="BRH Malayalam Extra" w:hAnsi="BRH Malayalam Extra" w:cs="BRH Devanagari Extra"/>
-                <w:b/>
-                <w:color w:val="000000"/>
-                <w:sz w:val="32"/>
-                <w:szCs w:val="40"/>
-              </w:rPr>
-              <w:t>–</w:t>
-            </w:r>
-            <w:r>
-              <w:rPr>
-                <w:rFonts w:ascii="BRH Devanagari Extra" w:hAnsi="BRH Devanagari Extra" w:cs="BRH Devanagari Extra"/>
-                <w:color w:val="000000"/>
-                <w:sz w:val="40"/>
-                <w:szCs w:val="40"/>
-              </w:rPr>
-              <w:t xml:space="preserve"> ÍqÉ§ÉÉÿ - uÉ</w:t>
+            <w:proofErr w:type="spellEnd"/>
+            <w:r>
+              <w:rPr>
+                <w:rFonts w:ascii="BRH Malayalam Extra" w:hAnsi="BRH Malayalam Extra" w:cs="BRH Devanagari Extra"/>
+                <w:b/>
+                <w:color w:val="000000"/>
+                <w:sz w:val="32"/>
+                <w:szCs w:val="40"/>
+              </w:rPr>
+              <w:t>–</w:t>
+            </w:r>
+            <w:r>
+              <w:rPr>
+                <w:rFonts w:ascii="BRH Devanagari Extra" w:hAnsi="BRH Devanagari Extra" w:cs="BRH Devanagari Extra"/>
+                <w:color w:val="000000"/>
+                <w:sz w:val="40"/>
+                <w:szCs w:val="40"/>
+              </w:rPr>
+              <w:t xml:space="preserve"> </w:t>
+            </w:r>
+            <w:proofErr w:type="spellStart"/>
+            <w:r>
+              <w:rPr>
+                <w:rFonts w:ascii="BRH Devanagari Extra" w:hAnsi="BRH Devanagari Extra" w:cs="BRH Devanagari Extra"/>
+                <w:color w:val="000000"/>
+                <w:sz w:val="40"/>
+                <w:szCs w:val="40"/>
+              </w:rPr>
+              <w:t>ÍqÉ§ÉÉÿ</w:t>
+            </w:r>
+            <w:proofErr w:type="spellEnd"/>
+            <w:r>
+              <w:rPr>
+                <w:rFonts w:ascii="BRH Devanagari Extra" w:hAnsi="BRH Devanagari Extra" w:cs="BRH Devanagari Extra"/>
+                <w:color w:val="000000"/>
+                <w:sz w:val="40"/>
+                <w:szCs w:val="40"/>
+              </w:rPr>
+              <w:t xml:space="preserve"> - uÉ</w:t>
             </w:r>
             <w:r>
               <w:rPr>
@@ -4020,6 +5109,7 @@
                 <w:szCs w:val="40"/>
               </w:rPr>
             </w:pPr>
+            <w:proofErr w:type="spellStart"/>
             <w:r>
               <w:rPr>
                 <w:rFonts w:ascii="BRH Devanagari Extra" w:hAnsi="BRH Devanagari Extra" w:cs="BRH Devanagari Extra"/>
@@ -4029,24 +5119,55 @@
               </w:rPr>
               <w:t>AlÉþmÉÉåokÉÉå</w:t>
             </w:r>
-            <w:r>
-              <w:rPr>
-                <w:rFonts w:ascii="BRH Malayalam Extra" w:hAnsi="BRH Malayalam Extra" w:cs="BRH Devanagari Extra"/>
-                <w:b/>
-                <w:color w:val="000000"/>
-                <w:sz w:val="32"/>
-                <w:szCs w:val="40"/>
-              </w:rPr>
-              <w:t>–</w:t>
-            </w:r>
-            <w:r>
-              <w:rPr>
-                <w:rFonts w:ascii="BRH Devanagari Extra" w:hAnsi="BRH Devanagari Extra" w:cs="BRH Devanagari Extra"/>
-                <w:color w:val="000000"/>
-                <w:sz w:val="40"/>
-                <w:szCs w:val="40"/>
-              </w:rPr>
-              <w:t xml:space="preserve"> eÉÉrÉåþiÉ | AlÉþmÉÉå</w:t>
+            <w:proofErr w:type="spellEnd"/>
+            <w:r>
+              <w:rPr>
+                <w:rFonts w:ascii="BRH Malayalam Extra" w:hAnsi="BRH Malayalam Extra" w:cs="BRH Devanagari Extra"/>
+                <w:b/>
+                <w:color w:val="000000"/>
+                <w:sz w:val="32"/>
+                <w:szCs w:val="40"/>
+              </w:rPr>
+              <w:t>–</w:t>
+            </w:r>
+            <w:r>
+              <w:rPr>
+                <w:rFonts w:ascii="BRH Devanagari Extra" w:hAnsi="BRH Devanagari Extra" w:cs="BRH Devanagari Extra"/>
+                <w:color w:val="000000"/>
+                <w:sz w:val="40"/>
+                <w:szCs w:val="40"/>
+              </w:rPr>
+              <w:t xml:space="preserve"> </w:t>
+            </w:r>
+            <w:proofErr w:type="spellStart"/>
+            <w:r>
+              <w:rPr>
+                <w:rFonts w:ascii="BRH Devanagari Extra" w:hAnsi="BRH Devanagari Extra" w:cs="BRH Devanagari Extra"/>
+                <w:color w:val="000000"/>
+                <w:sz w:val="40"/>
+                <w:szCs w:val="40"/>
+              </w:rPr>
+              <w:t>eÉÉrÉåþiÉ</w:t>
+            </w:r>
+            <w:proofErr w:type="spellEnd"/>
+            <w:r>
+              <w:rPr>
+                <w:rFonts w:ascii="BRH Devanagari Extra" w:hAnsi="BRH Devanagari Extra" w:cs="BRH Devanagari Extra"/>
+                <w:color w:val="000000"/>
+                <w:sz w:val="40"/>
+                <w:szCs w:val="40"/>
+              </w:rPr>
+              <w:t xml:space="preserve"> | </w:t>
+            </w:r>
+            <w:proofErr w:type="spellStart"/>
+            <w:r>
+              <w:rPr>
+                <w:rFonts w:ascii="BRH Devanagari Extra" w:hAnsi="BRH Devanagari Extra" w:cs="BRH Devanagari Extra"/>
+                <w:color w:val="000000"/>
+                <w:sz w:val="40"/>
+                <w:szCs w:val="40"/>
+              </w:rPr>
+              <w:t>AlÉþmÉÉå</w:t>
             </w:r>
             <w:r>
               <w:rPr>
@@ -4058,6 +5179,7 @@
               </w:rPr>
               <w:t>oS</w:t>
             </w:r>
+            <w:proofErr w:type="spellEnd"/>
             <w:r>
               <w:rPr>
                 <w:rFonts w:ascii="BRH Malayalam Extra" w:hAnsi="BRH Malayalam Extra" w:cs="BRH Devanagari Extra"/>
@@ -4076,18 +5198,39 @@
                 <w:sz w:val="40"/>
                 <w:szCs w:val="40"/>
               </w:rPr>
-              <w:t xml:space="preserve"> CirÉlÉþmÉ - E</w:t>
-            </w:r>
-            <w:r>
-              <w:rPr>
-                <w:rFonts w:ascii="BRH Malayalam Extra" w:hAnsi="BRH Malayalam Extra" w:cs="BRH Devanagari Extra"/>
-                <w:b/>
-                <w:color w:val="000000"/>
-                <w:sz w:val="32"/>
-                <w:szCs w:val="40"/>
-              </w:rPr>
-              <w:t>–</w:t>
-            </w:r>
+              <w:t xml:space="preserve"> </w:t>
+            </w:r>
+            <w:proofErr w:type="spellStart"/>
+            <w:r>
+              <w:rPr>
+                <w:rFonts w:ascii="BRH Devanagari Extra" w:hAnsi="BRH Devanagari Extra" w:cs="BRH Devanagari Extra"/>
+                <w:color w:val="000000"/>
+                <w:sz w:val="40"/>
+                <w:szCs w:val="40"/>
+              </w:rPr>
+              <w:t>CirÉlÉþmÉ</w:t>
+            </w:r>
+            <w:proofErr w:type="spellEnd"/>
+            <w:r>
+              <w:rPr>
+                <w:rFonts w:ascii="BRH Devanagari Extra" w:hAnsi="BRH Devanagari Extra" w:cs="BRH Devanagari Extra"/>
+                <w:color w:val="000000"/>
+                <w:sz w:val="40"/>
+                <w:szCs w:val="40"/>
+              </w:rPr>
+              <w:t xml:space="preserve"> - E</w:t>
+            </w:r>
+            <w:r>
+              <w:rPr>
+                <w:rFonts w:ascii="BRH Malayalam Extra" w:hAnsi="BRH Malayalam Extra" w:cs="BRH Devanagari Extra"/>
+                <w:b/>
+                <w:color w:val="000000"/>
+                <w:sz w:val="32"/>
+                <w:szCs w:val="40"/>
+              </w:rPr>
+              <w:t>–</w:t>
+            </w:r>
+            <w:proofErr w:type="spellStart"/>
             <w:r>
               <w:rPr>
                 <w:rFonts w:ascii="BRH Devanagari Extra" w:hAnsi="BRH Devanagari Extra" w:cs="BRH Devanagari Extra"/>
@@ -4097,6 +5240,7 @@
               </w:rPr>
               <w:t>okÉ</w:t>
             </w:r>
+            <w:proofErr w:type="spellEnd"/>
             <w:r>
               <w:rPr>
                 <w:rFonts w:ascii="BRH Malayalam Extra" w:hAnsi="BRH Malayalam Extra" w:cs="BRH Devanagari Extra"/>
@@ -4141,6 +5285,7 @@
                 <w:szCs w:val="40"/>
               </w:rPr>
             </w:pPr>
+            <w:proofErr w:type="spellStart"/>
             <w:r>
               <w:rPr>
                 <w:rFonts w:ascii="BRH Devanagari Extra" w:hAnsi="BRH Devanagari Extra" w:cs="BRH Devanagari Extra"/>
@@ -4150,24 +5295,55 @@
               </w:rPr>
               <w:t>AlÉþmÉÉåokÉÉå</w:t>
             </w:r>
-            <w:r>
-              <w:rPr>
-                <w:rFonts w:ascii="BRH Malayalam Extra" w:hAnsi="BRH Malayalam Extra" w:cs="BRH Devanagari Extra"/>
-                <w:b/>
-                <w:color w:val="000000"/>
-                <w:sz w:val="32"/>
-                <w:szCs w:val="40"/>
-              </w:rPr>
-              <w:t>–</w:t>
-            </w:r>
-            <w:r>
-              <w:rPr>
-                <w:rFonts w:ascii="BRH Devanagari Extra" w:hAnsi="BRH Devanagari Extra" w:cs="BRH Devanagari Extra"/>
-                <w:color w:val="000000"/>
-                <w:sz w:val="40"/>
-                <w:szCs w:val="40"/>
-              </w:rPr>
-              <w:t xml:space="preserve"> eÉÉrÉåþiÉ | AlÉþmÉÉå</w:t>
+            <w:proofErr w:type="spellEnd"/>
+            <w:r>
+              <w:rPr>
+                <w:rFonts w:ascii="BRH Malayalam Extra" w:hAnsi="BRH Malayalam Extra" w:cs="BRH Devanagari Extra"/>
+                <w:b/>
+                <w:color w:val="000000"/>
+                <w:sz w:val="32"/>
+                <w:szCs w:val="40"/>
+              </w:rPr>
+              <w:t>–</w:t>
+            </w:r>
+            <w:r>
+              <w:rPr>
+                <w:rFonts w:ascii="BRH Devanagari Extra" w:hAnsi="BRH Devanagari Extra" w:cs="BRH Devanagari Extra"/>
+                <w:color w:val="000000"/>
+                <w:sz w:val="40"/>
+                <w:szCs w:val="40"/>
+              </w:rPr>
+              <w:t xml:space="preserve"> </w:t>
+            </w:r>
+            <w:proofErr w:type="spellStart"/>
+            <w:r>
+              <w:rPr>
+                <w:rFonts w:ascii="BRH Devanagari Extra" w:hAnsi="BRH Devanagari Extra" w:cs="BRH Devanagari Extra"/>
+                <w:color w:val="000000"/>
+                <w:sz w:val="40"/>
+                <w:szCs w:val="40"/>
+              </w:rPr>
+              <w:t>eÉÉrÉåþiÉ</w:t>
+            </w:r>
+            <w:proofErr w:type="spellEnd"/>
+            <w:r>
+              <w:rPr>
+                <w:rFonts w:ascii="BRH Devanagari Extra" w:hAnsi="BRH Devanagari Extra" w:cs="BRH Devanagari Extra"/>
+                <w:color w:val="000000"/>
+                <w:sz w:val="40"/>
+                <w:szCs w:val="40"/>
+              </w:rPr>
+              <w:t xml:space="preserve"> | </w:t>
+            </w:r>
+            <w:proofErr w:type="spellStart"/>
+            <w:r>
+              <w:rPr>
+                <w:rFonts w:ascii="BRH Devanagari Extra" w:hAnsi="BRH Devanagari Extra" w:cs="BRH Devanagari Extra"/>
+                <w:color w:val="000000"/>
+                <w:sz w:val="40"/>
+                <w:szCs w:val="40"/>
+              </w:rPr>
+              <w:t>AlÉþmÉÉå</w:t>
             </w:r>
             <w:r>
               <w:rPr>
@@ -4179,35 +5355,57 @@
               </w:rPr>
               <w:t>okÉ</w:t>
             </w:r>
-            <w:r>
-              <w:rPr>
-                <w:rFonts w:ascii="BRH Malayalam Extra" w:hAnsi="BRH Malayalam Extra" w:cs="BRH Devanagari Extra"/>
-                <w:b/>
-                <w:color w:val="000000"/>
-                <w:sz w:val="32"/>
-                <w:szCs w:val="40"/>
-              </w:rPr>
-              <w:t>–</w:t>
-            </w:r>
-            <w:r>
-              <w:rPr>
-                <w:rFonts w:ascii="BRH Devanagari Extra" w:hAnsi="BRH Devanagari Extra" w:cs="BRH Devanagari Extra"/>
-                <w:color w:val="000000"/>
-                <w:sz w:val="40"/>
-                <w:szCs w:val="40"/>
-              </w:rPr>
-              <w:t xml:space="preserve"> CirÉlÉþmÉ - E</w:t>
-            </w:r>
-            <w:r>
-              <w:rPr>
-                <w:rFonts w:ascii="BRH Malayalam Extra" w:hAnsi="BRH Malayalam Extra" w:cs="BRH Devanagari Extra"/>
-                <w:b/>
-                <w:color w:val="000000"/>
-                <w:sz w:val="32"/>
-                <w:szCs w:val="40"/>
-              </w:rPr>
-              <w:t>–</w:t>
-            </w:r>
+            <w:proofErr w:type="spellEnd"/>
+            <w:r>
+              <w:rPr>
+                <w:rFonts w:ascii="BRH Malayalam Extra" w:hAnsi="BRH Malayalam Extra" w:cs="BRH Devanagari Extra"/>
+                <w:b/>
+                <w:color w:val="000000"/>
+                <w:sz w:val="32"/>
+                <w:szCs w:val="40"/>
+              </w:rPr>
+              <w:t>–</w:t>
+            </w:r>
+            <w:r>
+              <w:rPr>
+                <w:rFonts w:ascii="BRH Devanagari Extra" w:hAnsi="BRH Devanagari Extra" w:cs="BRH Devanagari Extra"/>
+                <w:color w:val="000000"/>
+                <w:sz w:val="40"/>
+                <w:szCs w:val="40"/>
+              </w:rPr>
+              <w:t xml:space="preserve"> </w:t>
+            </w:r>
+            <w:proofErr w:type="spellStart"/>
+            <w:r>
+              <w:rPr>
+                <w:rFonts w:ascii="BRH Devanagari Extra" w:hAnsi="BRH Devanagari Extra" w:cs="BRH Devanagari Extra"/>
+                <w:color w:val="000000"/>
+                <w:sz w:val="40"/>
+                <w:szCs w:val="40"/>
+              </w:rPr>
+              <w:t>CirÉlÉþmÉ</w:t>
+            </w:r>
+            <w:proofErr w:type="spellEnd"/>
+            <w:r>
+              <w:rPr>
+                <w:rFonts w:ascii="BRH Devanagari Extra" w:hAnsi="BRH Devanagari Extra" w:cs="BRH Devanagari Extra"/>
+                <w:color w:val="000000"/>
+                <w:sz w:val="40"/>
+                <w:szCs w:val="40"/>
+              </w:rPr>
+              <w:t xml:space="preserve"> - E</w:t>
+            </w:r>
+            <w:r>
+              <w:rPr>
+                <w:rFonts w:ascii="BRH Malayalam Extra" w:hAnsi="BRH Malayalam Extra" w:cs="BRH Devanagari Extra"/>
+                <w:b/>
+                <w:color w:val="000000"/>
+                <w:sz w:val="32"/>
+                <w:szCs w:val="40"/>
+              </w:rPr>
+              <w:t>–</w:t>
+            </w:r>
+            <w:proofErr w:type="spellStart"/>
             <w:r>
               <w:rPr>
                 <w:rFonts w:ascii="BRH Devanagari Extra" w:hAnsi="BRH Devanagari Extra" w:cs="BRH Devanagari Extra"/>
@@ -4217,6 +5415,7 @@
               </w:rPr>
               <w:t>okÉ</w:t>
             </w:r>
+            <w:proofErr w:type="spellEnd"/>
             <w:r>
               <w:rPr>
                 <w:rFonts w:ascii="BRH Malayalam Extra" w:hAnsi="BRH Malayalam Extra" w:cs="BRH Devanagari Extra"/>
@@ -4419,33 +5618,55 @@
                 <w:szCs w:val="40"/>
               </w:rPr>
             </w:pPr>
-            <w:r>
-              <w:rPr>
-                <w:rFonts w:ascii="BRH Devanagari Extra" w:hAnsi="BRH Devanagari Extra" w:cs="BRH Devanagari Extra"/>
-                <w:color w:val="000000"/>
-                <w:sz w:val="40"/>
-                <w:szCs w:val="40"/>
-              </w:rPr>
-              <w:t>iÉxqÉÉþ L</w:t>
-            </w:r>
-            <w:r>
-              <w:rPr>
-                <w:rFonts w:ascii="BRH Malayalam Extra" w:hAnsi="BRH Malayalam Extra" w:cs="BRH Devanagari Extra"/>
-                <w:b/>
-                <w:color w:val="000000"/>
-                <w:sz w:val="32"/>
-                <w:szCs w:val="40"/>
-              </w:rPr>
-              <w:t>–</w:t>
-            </w:r>
-            <w:r>
-              <w:rPr>
-                <w:rFonts w:ascii="BRH Devanagari Extra" w:hAnsi="BRH Devanagari Extra" w:cs="BRH Devanagari Extra"/>
-                <w:color w:val="000000"/>
-                <w:sz w:val="40"/>
-                <w:szCs w:val="40"/>
-              </w:rPr>
-              <w:t xml:space="preserve">iÉqÉç | </w:t>
+            <w:proofErr w:type="spellStart"/>
+            <w:r>
+              <w:rPr>
+                <w:rFonts w:ascii="BRH Devanagari Extra" w:hAnsi="BRH Devanagari Extra" w:cs="BRH Devanagari Extra"/>
+                <w:color w:val="000000"/>
+                <w:sz w:val="40"/>
+                <w:szCs w:val="40"/>
+              </w:rPr>
+              <w:t>iÉxqÉÉþ</w:t>
+            </w:r>
+            <w:proofErr w:type="spellEnd"/>
+            <w:r>
+              <w:rPr>
+                <w:rFonts w:ascii="BRH Devanagari Extra" w:hAnsi="BRH Devanagari Extra" w:cs="BRH Devanagari Extra"/>
+                <w:color w:val="000000"/>
+                <w:sz w:val="40"/>
+                <w:szCs w:val="40"/>
+              </w:rPr>
+              <w:t xml:space="preserve"> L</w:t>
+            </w:r>
+            <w:r>
+              <w:rPr>
+                <w:rFonts w:ascii="BRH Malayalam Extra" w:hAnsi="BRH Malayalam Extra" w:cs="BRH Devanagari Extra"/>
+                <w:b/>
+                <w:color w:val="000000"/>
+                <w:sz w:val="32"/>
+                <w:szCs w:val="40"/>
+              </w:rPr>
+              <w:t>–</w:t>
+            </w:r>
+            <w:proofErr w:type="spellStart"/>
+            <w:r>
+              <w:rPr>
+                <w:rFonts w:ascii="BRH Devanagari Extra" w:hAnsi="BRH Devanagari Extra" w:cs="BRH Devanagari Extra"/>
+                <w:color w:val="000000"/>
+                <w:sz w:val="40"/>
+                <w:szCs w:val="40"/>
+              </w:rPr>
+              <w:t>iÉqÉç</w:t>
+            </w:r>
+            <w:proofErr w:type="spellEnd"/>
+            <w:r>
+              <w:rPr>
+                <w:rFonts w:ascii="BRH Devanagari Extra" w:hAnsi="BRH Devanagari Extra" w:cs="BRH Devanagari Extra"/>
+                <w:color w:val="000000"/>
+                <w:sz w:val="40"/>
+                <w:szCs w:val="40"/>
+              </w:rPr>
+              <w:t xml:space="preserve"> | </w:t>
             </w:r>
           </w:p>
           <w:p>
@@ -4465,6 +5686,7 @@
                 <w:sz w:val="40"/>
                 <w:szCs w:val="40"/>
               </w:rPr>
+              <w:lastRenderedPageBreak/>
               <w:t>L</w:t>
             </w:r>
             <w:r>
@@ -4477,6 +5699,7 @@
               </w:rPr>
               <w:t>–</w:t>
             </w:r>
+            <w:proofErr w:type="spellStart"/>
             <w:r>
               <w:rPr>
                 <w:rFonts w:ascii="BRH Devanagari Extra" w:hAnsi="BRH Devanagari Extra" w:cs="BRH Devanagari Extra"/>
@@ -4505,24 +5728,36 @@
               </w:rPr>
               <w:t>ælSìÉoÉÉUç.WûxmÉ</w:t>
             </w:r>
-            <w:r>
-              <w:rPr>
-                <w:rFonts w:ascii="BRH Malayalam Extra" w:hAnsi="BRH Malayalam Extra" w:cs="BRH Devanagari Extra"/>
-                <w:b/>
-                <w:color w:val="000000"/>
-                <w:sz w:val="32"/>
-                <w:szCs w:val="40"/>
-              </w:rPr>
-              <w:t>–</w:t>
-            </w:r>
-            <w:r>
-              <w:rPr>
-                <w:rFonts w:ascii="BRH Devanagari Extra" w:hAnsi="BRH Devanagari Extra" w:cs="BRH Devanagari Extra"/>
-                <w:color w:val="000000"/>
-                <w:sz w:val="40"/>
-                <w:szCs w:val="40"/>
-              </w:rPr>
-              <w:t>irÉqÉç |</w:t>
+            <w:proofErr w:type="spellEnd"/>
+            <w:r>
+              <w:rPr>
+                <w:rFonts w:ascii="BRH Malayalam Extra" w:hAnsi="BRH Malayalam Extra" w:cs="BRH Devanagari Extra"/>
+                <w:b/>
+                <w:color w:val="000000"/>
+                <w:sz w:val="32"/>
+                <w:szCs w:val="40"/>
+              </w:rPr>
+              <w:t>–</w:t>
+            </w:r>
+            <w:proofErr w:type="spellStart"/>
+            <w:r>
+              <w:rPr>
+                <w:rFonts w:ascii="BRH Devanagari Extra" w:hAnsi="BRH Devanagari Extra" w:cs="BRH Devanagari Extra"/>
+                <w:color w:val="000000"/>
+                <w:sz w:val="40"/>
+                <w:szCs w:val="40"/>
+              </w:rPr>
+              <w:t>irÉqÉç</w:t>
+            </w:r>
+            <w:proofErr w:type="spellEnd"/>
+            <w:r>
+              <w:rPr>
+                <w:rFonts w:ascii="BRH Devanagari Extra" w:hAnsi="BRH Devanagari Extra" w:cs="BRH Devanagari Extra"/>
+                <w:color w:val="000000"/>
+                <w:sz w:val="40"/>
+                <w:szCs w:val="40"/>
+              </w:rPr>
+              <w:t xml:space="preserve"> |</w:t>
             </w:r>
           </w:p>
         </w:tc>
@@ -4546,33 +5781,56 @@
                 <w:szCs w:val="40"/>
               </w:rPr>
             </w:pPr>
-            <w:r>
-              <w:rPr>
-                <w:rFonts w:ascii="BRH Devanagari Extra" w:hAnsi="BRH Devanagari Extra" w:cs="BRH Devanagari Extra"/>
-                <w:color w:val="000000"/>
-                <w:sz w:val="40"/>
-                <w:szCs w:val="40"/>
-              </w:rPr>
-              <w:t>iÉxqÉÉþ L</w:t>
-            </w:r>
-            <w:r>
-              <w:rPr>
-                <w:rFonts w:ascii="BRH Malayalam Extra" w:hAnsi="BRH Malayalam Extra" w:cs="BRH Devanagari Extra"/>
-                <w:b/>
-                <w:color w:val="000000"/>
-                <w:sz w:val="32"/>
-                <w:szCs w:val="40"/>
-              </w:rPr>
-              <w:t>–</w:t>
-            </w:r>
-            <w:r>
-              <w:rPr>
-                <w:rFonts w:ascii="BRH Devanagari Extra" w:hAnsi="BRH Devanagari Extra" w:cs="BRH Devanagari Extra"/>
-                <w:color w:val="000000"/>
-                <w:sz w:val="40"/>
-                <w:szCs w:val="40"/>
-              </w:rPr>
-              <w:t xml:space="preserve">iÉqÉç | </w:t>
+            <w:proofErr w:type="spellStart"/>
+            <w:r>
+              <w:rPr>
+                <w:rFonts w:ascii="BRH Devanagari Extra" w:hAnsi="BRH Devanagari Extra" w:cs="BRH Devanagari Extra"/>
+                <w:color w:val="000000"/>
+                <w:sz w:val="40"/>
+                <w:szCs w:val="40"/>
+              </w:rPr>
+              <w:lastRenderedPageBreak/>
+              <w:t>iÉxqÉÉþ</w:t>
+            </w:r>
+            <w:proofErr w:type="spellEnd"/>
+            <w:r>
+              <w:rPr>
+                <w:rFonts w:ascii="BRH Devanagari Extra" w:hAnsi="BRH Devanagari Extra" w:cs="BRH Devanagari Extra"/>
+                <w:color w:val="000000"/>
+                <w:sz w:val="40"/>
+                <w:szCs w:val="40"/>
+              </w:rPr>
+              <w:t xml:space="preserve"> L</w:t>
+            </w:r>
+            <w:r>
+              <w:rPr>
+                <w:rFonts w:ascii="BRH Malayalam Extra" w:hAnsi="BRH Malayalam Extra" w:cs="BRH Devanagari Extra"/>
+                <w:b/>
+                <w:color w:val="000000"/>
+                <w:sz w:val="32"/>
+                <w:szCs w:val="40"/>
+              </w:rPr>
+              <w:t>–</w:t>
+            </w:r>
+            <w:proofErr w:type="spellStart"/>
+            <w:r>
+              <w:rPr>
+                <w:rFonts w:ascii="BRH Devanagari Extra" w:hAnsi="BRH Devanagari Extra" w:cs="BRH Devanagari Extra"/>
+                <w:color w:val="000000"/>
+                <w:sz w:val="40"/>
+                <w:szCs w:val="40"/>
+              </w:rPr>
+              <w:t>iÉqÉç</w:t>
+            </w:r>
+            <w:proofErr w:type="spellEnd"/>
+            <w:r>
+              <w:rPr>
+                <w:rFonts w:ascii="BRH Devanagari Extra" w:hAnsi="BRH Devanagari Extra" w:cs="BRH Devanagari Extra"/>
+                <w:color w:val="000000"/>
+                <w:sz w:val="40"/>
+                <w:szCs w:val="40"/>
+              </w:rPr>
+              <w:t xml:space="preserve"> | </w:t>
             </w:r>
           </w:p>
           <w:p>
@@ -4596,6 +5854,7 @@
                 <w:sz w:val="40"/>
                 <w:szCs w:val="40"/>
               </w:rPr>
+              <w:lastRenderedPageBreak/>
               <w:t>L</w:t>
             </w:r>
             <w:r>
@@ -4608,6 +5867,7 @@
               </w:rPr>
               <w:t>–</w:t>
             </w:r>
+            <w:proofErr w:type="spellStart"/>
             <w:r>
               <w:rPr>
                 <w:rFonts w:ascii="BRH Devanagari Extra" w:hAnsi="BRH Devanagari Extra" w:cs="BRH Devanagari Extra"/>
@@ -4636,24 +5896,36 @@
               </w:rPr>
               <w:t>ÿlSìÉoÉÉUç.WûxmÉ</w:t>
             </w:r>
-            <w:r>
-              <w:rPr>
-                <w:rFonts w:ascii="BRH Malayalam Extra" w:hAnsi="BRH Malayalam Extra" w:cs="BRH Devanagari Extra"/>
-                <w:b/>
-                <w:color w:val="000000"/>
-                <w:sz w:val="32"/>
-                <w:szCs w:val="40"/>
-              </w:rPr>
-              <w:t>–</w:t>
-            </w:r>
-            <w:r>
-              <w:rPr>
-                <w:rFonts w:ascii="BRH Devanagari Extra" w:hAnsi="BRH Devanagari Extra" w:cs="BRH Devanagari Extra"/>
-                <w:color w:val="000000"/>
-                <w:sz w:val="40"/>
-                <w:szCs w:val="40"/>
-              </w:rPr>
-              <w:t>irÉqÉç |</w:t>
+            <w:proofErr w:type="spellEnd"/>
+            <w:r>
+              <w:rPr>
+                <w:rFonts w:ascii="BRH Malayalam Extra" w:hAnsi="BRH Malayalam Extra" w:cs="BRH Devanagari Extra"/>
+                <w:b/>
+                <w:color w:val="000000"/>
+                <w:sz w:val="32"/>
+                <w:szCs w:val="40"/>
+              </w:rPr>
+              <w:t>–</w:t>
+            </w:r>
+            <w:proofErr w:type="spellStart"/>
+            <w:r>
+              <w:rPr>
+                <w:rFonts w:ascii="BRH Devanagari Extra" w:hAnsi="BRH Devanagari Extra" w:cs="BRH Devanagari Extra"/>
+                <w:color w:val="000000"/>
+                <w:sz w:val="40"/>
+                <w:szCs w:val="40"/>
+              </w:rPr>
+              <w:t>irÉqÉç</w:t>
+            </w:r>
+            <w:proofErr w:type="spellEnd"/>
+            <w:r>
+              <w:rPr>
+                <w:rFonts w:ascii="BRH Devanagari Extra" w:hAnsi="BRH Devanagari Extra" w:cs="BRH Devanagari Extra"/>
+                <w:color w:val="000000"/>
+                <w:sz w:val="40"/>
+                <w:szCs w:val="40"/>
+              </w:rPr>
+              <w:t xml:space="preserve"> |</w:t>
             </w:r>
           </w:p>
         </w:tc>
@@ -4696,6 +5968,7 @@
                 <w:sz w:val="28"/>
                 <w:szCs w:val="32"/>
               </w:rPr>
+              <w:lastRenderedPageBreak/>
               <w:t>T.S.2.</w:t>
             </w:r>
             <w:r>
@@ -4838,6 +6111,7 @@
                 <w:szCs w:val="40"/>
               </w:rPr>
             </w:pPr>
+            <w:proofErr w:type="spellStart"/>
             <w:r>
               <w:rPr>
                 <w:rFonts w:ascii="BRH Devanagari Extra" w:hAnsi="BRH Devanagari Extra" w:cs="BRH Devanagari Extra"/>
@@ -4847,24 +6121,45 @@
               </w:rPr>
               <w:t>SÉqlÉÉå</w:t>
             </w:r>
-            <w:r>
-              <w:rPr>
-                <w:rFonts w:ascii="BRH Malayalam Extra" w:hAnsi="BRH Malayalam Extra" w:cs="BRH Devanagari Extra"/>
-                <w:b/>
-                <w:color w:val="000000"/>
-                <w:sz w:val="32"/>
-                <w:szCs w:val="40"/>
-              </w:rPr>
-              <w:t>–</w:t>
-            </w:r>
-            <w:r>
-              <w:rPr>
-                <w:rFonts w:ascii="BRH Devanagari Extra" w:hAnsi="BRH Devanagari Extra" w:cs="BRH Devanagari Extra"/>
-                <w:color w:val="000000"/>
-                <w:sz w:val="40"/>
-                <w:szCs w:val="40"/>
-              </w:rPr>
-              <w:t xml:space="preserve"> ÅmÉÉåqpÉþlÉÉiÉç | </w:t>
+            <w:proofErr w:type="spellEnd"/>
+            <w:r>
+              <w:rPr>
+                <w:rFonts w:ascii="BRH Malayalam Extra" w:hAnsi="BRH Malayalam Extra" w:cs="BRH Devanagari Extra"/>
+                <w:b/>
+                <w:color w:val="000000"/>
+                <w:sz w:val="32"/>
+                <w:szCs w:val="40"/>
+              </w:rPr>
+              <w:t>–</w:t>
+            </w:r>
+            <w:r>
+              <w:rPr>
+                <w:rFonts w:ascii="BRH Devanagari Extra" w:hAnsi="BRH Devanagari Extra" w:cs="BRH Devanagari Extra"/>
+                <w:color w:val="000000"/>
+                <w:sz w:val="40"/>
+                <w:szCs w:val="40"/>
+              </w:rPr>
+              <w:t xml:space="preserve"> </w:t>
+            </w:r>
+            <w:proofErr w:type="spellStart"/>
+            <w:r>
+              <w:rPr>
+                <w:rFonts w:ascii="BRH Devanagari Extra" w:hAnsi="BRH Devanagari Extra" w:cs="BRH Devanagari Extra"/>
+                <w:color w:val="000000"/>
+                <w:sz w:val="40"/>
+                <w:szCs w:val="40"/>
+              </w:rPr>
+              <w:t>ÅmÉÉåqpÉþlÉÉiÉç</w:t>
+            </w:r>
+            <w:proofErr w:type="spellEnd"/>
+            <w:r>
+              <w:rPr>
+                <w:rFonts w:ascii="BRH Devanagari Extra" w:hAnsi="BRH Devanagari Extra" w:cs="BRH Devanagari Extra"/>
+                <w:color w:val="000000"/>
+                <w:sz w:val="40"/>
+                <w:szCs w:val="40"/>
+              </w:rPr>
+              <w:t xml:space="preserve"> | </w:t>
             </w:r>
           </w:p>
           <w:p>
@@ -4896,6 +6191,7 @@
               </w:rPr>
               <w:t>–</w:t>
             </w:r>
+            <w:proofErr w:type="spellStart"/>
             <w:r>
               <w:rPr>
                 <w:rFonts w:ascii="BRH Devanagari Extra" w:hAnsi="BRH Devanagari Extra" w:cs="BRH Devanagari Extra"/>
@@ -4922,7 +6218,37 @@
                 <w:sz w:val="40"/>
                 <w:szCs w:val="40"/>
               </w:rPr>
-              <w:t>þlÉÉlÉç qÉÑgcÉÌiÉ |</w:t>
+              <w:t>þlÉÉlÉç</w:t>
+            </w:r>
+            <w:proofErr w:type="spellEnd"/>
+            <w:r>
+              <w:rPr>
+                <w:rFonts w:ascii="BRH Devanagari Extra" w:hAnsi="BRH Devanagari Extra" w:cs="BRH Devanagari Extra"/>
+                <w:color w:val="000000"/>
+                <w:sz w:val="40"/>
+                <w:szCs w:val="40"/>
+              </w:rPr>
+              <w:t xml:space="preserve"> </w:t>
+            </w:r>
+            <w:proofErr w:type="spellStart"/>
+            <w:r>
+              <w:rPr>
+                <w:rFonts w:ascii="BRH Devanagari Extra" w:hAnsi="BRH Devanagari Extra" w:cs="BRH Devanagari Extra"/>
+                <w:color w:val="000000"/>
+                <w:sz w:val="40"/>
+                <w:szCs w:val="40"/>
+              </w:rPr>
+              <w:t>qÉÑgcÉÌiÉ</w:t>
+            </w:r>
+            <w:proofErr w:type="spellEnd"/>
+            <w:r>
+              <w:rPr>
+                <w:rFonts w:ascii="BRH Devanagari Extra" w:hAnsi="BRH Devanagari Extra" w:cs="BRH Devanagari Extra"/>
+                <w:color w:val="000000"/>
+                <w:sz w:val="40"/>
+                <w:szCs w:val="40"/>
+              </w:rPr>
+              <w:t xml:space="preserve"> |</w:t>
             </w:r>
           </w:p>
         </w:tc>
@@ -4946,6 +6272,7 @@
                 <w:szCs w:val="40"/>
               </w:rPr>
             </w:pPr>
+            <w:proofErr w:type="spellStart"/>
             <w:r>
               <w:rPr>
                 <w:rFonts w:ascii="BRH Devanagari Extra" w:hAnsi="BRH Devanagari Extra" w:cs="BRH Devanagari Extra"/>
@@ -4955,24 +6282,45 @@
               </w:rPr>
               <w:t>SÉqlÉÉå</w:t>
             </w:r>
-            <w:r>
-              <w:rPr>
-                <w:rFonts w:ascii="BRH Malayalam Extra" w:hAnsi="BRH Malayalam Extra" w:cs="BRH Devanagari Extra"/>
-                <w:b/>
-                <w:color w:val="000000"/>
-                <w:sz w:val="32"/>
-                <w:szCs w:val="40"/>
-              </w:rPr>
-              <w:t>–</w:t>
-            </w:r>
-            <w:r>
-              <w:rPr>
-                <w:rFonts w:ascii="BRH Devanagari Extra" w:hAnsi="BRH Devanagari Extra" w:cs="BRH Devanagari Extra"/>
-                <w:color w:val="000000"/>
-                <w:sz w:val="40"/>
-                <w:szCs w:val="40"/>
-              </w:rPr>
-              <w:t xml:space="preserve"> ÅmÉÉåqpÉþlÉÉiÉç | </w:t>
+            <w:proofErr w:type="spellEnd"/>
+            <w:r>
+              <w:rPr>
+                <w:rFonts w:ascii="BRH Malayalam Extra" w:hAnsi="BRH Malayalam Extra" w:cs="BRH Devanagari Extra"/>
+                <w:b/>
+                <w:color w:val="000000"/>
+                <w:sz w:val="32"/>
+                <w:szCs w:val="40"/>
+              </w:rPr>
+              <w:t>–</w:t>
+            </w:r>
+            <w:r>
+              <w:rPr>
+                <w:rFonts w:ascii="BRH Devanagari Extra" w:hAnsi="BRH Devanagari Extra" w:cs="BRH Devanagari Extra"/>
+                <w:color w:val="000000"/>
+                <w:sz w:val="40"/>
+                <w:szCs w:val="40"/>
+              </w:rPr>
+              <w:t xml:space="preserve"> </w:t>
+            </w:r>
+            <w:proofErr w:type="spellStart"/>
+            <w:r>
+              <w:rPr>
+                <w:rFonts w:ascii="BRH Devanagari Extra" w:hAnsi="BRH Devanagari Extra" w:cs="BRH Devanagari Extra"/>
+                <w:color w:val="000000"/>
+                <w:sz w:val="40"/>
+                <w:szCs w:val="40"/>
+              </w:rPr>
+              <w:t>ÅmÉÉåqpÉþlÉÉiÉç</w:t>
+            </w:r>
+            <w:proofErr w:type="spellEnd"/>
+            <w:r>
+              <w:rPr>
+                <w:rFonts w:ascii="BRH Devanagari Extra" w:hAnsi="BRH Devanagari Extra" w:cs="BRH Devanagari Extra"/>
+                <w:color w:val="000000"/>
+                <w:sz w:val="40"/>
+                <w:szCs w:val="40"/>
+              </w:rPr>
+              <w:t xml:space="preserve"> | </w:t>
             </w:r>
           </w:p>
           <w:p>
@@ -5008,6 +6356,7 @@
               </w:rPr>
               <w:t>–</w:t>
             </w:r>
+            <w:proofErr w:type="spellStart"/>
             <w:r>
               <w:rPr>
                 <w:rFonts w:ascii="BRH Devanagari Extra" w:hAnsi="BRH Devanagari Extra" w:cs="BRH Devanagari Extra"/>
@@ -5034,7 +6383,37 @@
                 <w:sz w:val="40"/>
                 <w:szCs w:val="40"/>
               </w:rPr>
-              <w:t>þlÉÉlÉç qÉÑgcÉÌiÉ |</w:t>
+              <w:t>þlÉÉlÉç</w:t>
+            </w:r>
+            <w:proofErr w:type="spellEnd"/>
+            <w:r>
+              <w:rPr>
+                <w:rFonts w:ascii="BRH Devanagari Extra" w:hAnsi="BRH Devanagari Extra" w:cs="BRH Devanagari Extra"/>
+                <w:color w:val="000000"/>
+                <w:sz w:val="40"/>
+                <w:szCs w:val="40"/>
+              </w:rPr>
+              <w:t xml:space="preserve"> </w:t>
+            </w:r>
+            <w:proofErr w:type="spellStart"/>
+            <w:r>
+              <w:rPr>
+                <w:rFonts w:ascii="BRH Devanagari Extra" w:hAnsi="BRH Devanagari Extra" w:cs="BRH Devanagari Extra"/>
+                <w:color w:val="000000"/>
+                <w:sz w:val="40"/>
+                <w:szCs w:val="40"/>
+              </w:rPr>
+              <w:t>qÉÑgcÉÌiÉ</w:t>
+            </w:r>
+            <w:proofErr w:type="spellEnd"/>
+            <w:r>
+              <w:rPr>
+                <w:rFonts w:ascii="BRH Devanagari Extra" w:hAnsi="BRH Devanagari Extra" w:cs="BRH Devanagari Extra"/>
+                <w:color w:val="000000"/>
+                <w:sz w:val="40"/>
+                <w:szCs w:val="40"/>
+              </w:rPr>
+              <w:t xml:space="preserve"> |</w:t>
             </w:r>
           </w:p>
         </w:tc>
@@ -5077,7 +6456,6 @@
                 <w:sz w:val="28"/>
                 <w:szCs w:val="32"/>
               </w:rPr>
-              <w:lastRenderedPageBreak/>
               <w:t>T.S.2.</w:t>
             </w:r>
             <w:r>
@@ -5216,6 +6594,7 @@
                 <w:szCs w:val="40"/>
               </w:rPr>
             </w:pPr>
+            <w:proofErr w:type="spellStart"/>
             <w:r>
               <w:rPr>
                 <w:rFonts w:ascii="BRH Devanagari Extra" w:hAnsi="BRH Devanagari Extra" w:cs="BRH Devanagari Extra"/>
@@ -5225,16 +6604,18 @@
               </w:rPr>
               <w:t>qÉÑ</w:t>
             </w:r>
-            <w:r>
-              <w:rPr>
-                <w:rFonts w:ascii="BRH Malayalam Extra" w:hAnsi="BRH Malayalam Extra" w:cs="BRH Devanagari Extra"/>
-                <w:b/>
-                <w:color w:val="000000"/>
-                <w:sz w:val="32"/>
-                <w:szCs w:val="40"/>
-              </w:rPr>
-              <w:t>–</w:t>
-            </w:r>
+            <w:proofErr w:type="spellEnd"/>
+            <w:r>
+              <w:rPr>
+                <w:rFonts w:ascii="BRH Malayalam Extra" w:hAnsi="BRH Malayalam Extra" w:cs="BRH Devanagari Extra"/>
+                <w:b/>
+                <w:color w:val="000000"/>
+                <w:sz w:val="32"/>
+                <w:szCs w:val="40"/>
+              </w:rPr>
+              <w:t>–</w:t>
+            </w:r>
+            <w:proofErr w:type="spellStart"/>
             <w:r>
               <w:rPr>
                 <w:rFonts w:ascii="BRH Devanagari Extra" w:hAnsi="BRH Devanagari Extra" w:cs="BRH Devanagari Extra"/>
@@ -5244,16 +6625,18 @@
               </w:rPr>
               <w:t>gcÉ</w:t>
             </w:r>
-            <w:r>
-              <w:rPr>
-                <w:rFonts w:ascii="BRH Malayalam Extra" w:hAnsi="BRH Malayalam Extra" w:cs="BRH Devanagari Extra"/>
-                <w:b/>
-                <w:color w:val="000000"/>
-                <w:sz w:val="32"/>
-                <w:szCs w:val="40"/>
-              </w:rPr>
-              <w:t>–</w:t>
-            </w:r>
+            <w:proofErr w:type="spellEnd"/>
+            <w:r>
+              <w:rPr>
+                <w:rFonts w:ascii="BRH Malayalam Extra" w:hAnsi="BRH Malayalam Extra" w:cs="BRH Devanagari Extra"/>
+                <w:b/>
+                <w:color w:val="000000"/>
+                <w:sz w:val="32"/>
+                <w:szCs w:val="40"/>
+              </w:rPr>
+              <w:t>–</w:t>
+            </w:r>
+            <w:proofErr w:type="spellStart"/>
             <w:r>
               <w:rPr>
                 <w:rFonts w:ascii="BRH Devanagari Extra" w:hAnsi="BRH Devanagari Extra" w:cs="BRH Devanagari Extra"/>
@@ -5263,25 +6646,37 @@
               </w:rPr>
               <w:t>ÌiÉ</w:t>
             </w:r>
-            <w:r>
-              <w:rPr>
-                <w:rFonts w:ascii="BRH Malayalam Extra" w:hAnsi="BRH Malayalam Extra" w:cs="BRH Devanagari Extra"/>
-                <w:b/>
-                <w:color w:val="000000"/>
-                <w:sz w:val="32"/>
-                <w:szCs w:val="40"/>
-              </w:rPr>
-              <w:t>–</w:t>
-            </w:r>
-            <w:r>
-              <w:rPr>
-                <w:rFonts w:ascii="BRH Devanagari Extra" w:hAnsi="BRH Devanagari Extra" w:cs="BRH Devanagari Extra"/>
-                <w:color w:val="000000"/>
-                <w:sz w:val="40"/>
-                <w:szCs w:val="40"/>
-              </w:rPr>
-              <w:t xml:space="preserve"> ÌWû</w:t>
-            </w:r>
+            <w:proofErr w:type="spellEnd"/>
+            <w:r>
+              <w:rPr>
+                <w:rFonts w:ascii="BRH Malayalam Extra" w:hAnsi="BRH Malayalam Extra" w:cs="BRH Devanagari Extra"/>
+                <w:b/>
+                <w:color w:val="000000"/>
+                <w:sz w:val="32"/>
+                <w:szCs w:val="40"/>
+              </w:rPr>
+              <w:t>–</w:t>
+            </w:r>
+            <w:r>
+              <w:rPr>
+                <w:rFonts w:ascii="BRH Devanagari Extra" w:hAnsi="BRH Devanagari Extra" w:cs="BRH Devanagari Extra"/>
+                <w:color w:val="000000"/>
+                <w:sz w:val="40"/>
+                <w:szCs w:val="40"/>
+              </w:rPr>
+              <w:t xml:space="preserve"> </w:t>
+            </w:r>
+            <w:proofErr w:type="spellStart"/>
+            <w:r>
+              <w:rPr>
+                <w:rFonts w:ascii="BRH Devanagari Extra" w:hAnsi="BRH Devanagari Extra" w:cs="BRH Devanagari Extra"/>
+                <w:color w:val="000000"/>
+                <w:sz w:val="40"/>
+                <w:szCs w:val="40"/>
+              </w:rPr>
+              <w:t>ÌWû</w:t>
+            </w:r>
+            <w:proofErr w:type="spellEnd"/>
             <w:r>
               <w:rPr>
                 <w:rFonts w:ascii="BRH Malayalam Extra" w:hAnsi="BRH Malayalam Extra" w:cs="BRH Devanagari Extra"/>
@@ -5311,14 +6706,25 @@
               </w:rPr>
               <w:t>–</w:t>
             </w:r>
-            <w:r>
-              <w:rPr>
-                <w:rFonts w:ascii="BRH Devanagari Extra" w:hAnsi="BRH Devanagari Extra" w:cs="BRH Devanagari Extra"/>
-                <w:color w:val="000000"/>
-                <w:sz w:val="40"/>
-                <w:szCs w:val="40"/>
-              </w:rPr>
-              <w:t xml:space="preserve">hqÉrÉÿqÉç | </w:t>
+            <w:proofErr w:type="spellStart"/>
+            <w:r>
+              <w:rPr>
+                <w:rFonts w:ascii="BRH Devanagari Extra" w:hAnsi="BRH Devanagari Extra" w:cs="BRH Devanagari Extra"/>
+                <w:color w:val="000000"/>
+                <w:sz w:val="40"/>
+                <w:szCs w:val="40"/>
+              </w:rPr>
+              <w:t>hqÉrÉÿqÉç</w:t>
+            </w:r>
+            <w:proofErr w:type="spellEnd"/>
+            <w:r>
+              <w:rPr>
+                <w:rFonts w:ascii="BRH Devanagari Extra" w:hAnsi="BRH Devanagari Extra" w:cs="BRH Devanagari Extra"/>
+                <w:color w:val="000000"/>
+                <w:sz w:val="40"/>
+                <w:szCs w:val="40"/>
+              </w:rPr>
+              <w:t xml:space="preserve"> | </w:t>
             </w:r>
           </w:p>
           <w:p>
@@ -5331,6 +6737,7 @@
                 <w:szCs w:val="40"/>
               </w:rPr>
             </w:pPr>
+            <w:proofErr w:type="spellStart"/>
             <w:r>
               <w:rPr>
                 <w:rFonts w:ascii="BRH Devanagari Extra" w:hAnsi="BRH Devanagari Extra" w:cs="BRH Devanagari Extra"/>
@@ -5340,6 +6747,7 @@
               </w:rPr>
               <w:t>ÌWû</w:t>
             </w:r>
+            <w:proofErr w:type="spellEnd"/>
             <w:r>
               <w:rPr>
                 <w:rFonts w:ascii="BRH Malayalam Extra" w:hAnsi="BRH Malayalam Extra" w:cs="BRH Devanagari Extra"/>
@@ -5369,6 +6777,7 @@
               </w:rPr>
               <w:t>–</w:t>
             </w:r>
+            <w:proofErr w:type="spellStart"/>
             <w:r>
               <w:rPr>
                 <w:rFonts w:ascii="BRH Devanagari Extra" w:hAnsi="BRH Devanagari Extra" w:cs="BRH Devanagari Extra"/>
@@ -5388,6 +6797,7 @@
               </w:rPr>
               <w:t>qÉ</w:t>
             </w:r>
+            <w:proofErr w:type="spellEnd"/>
             <w:r>
               <w:rPr>
                 <w:rFonts w:ascii="BRH Malayalam Extra" w:hAnsi="BRH Malayalam Extra" w:cs="BRH Devanagari Extra"/>
@@ -5424,7 +6834,27 @@
                 <w:sz w:val="40"/>
                 <w:szCs w:val="40"/>
               </w:rPr>
-              <w:t>Ç SÉqÉþ |</w:t>
+              <w:t xml:space="preserve">Ç </w:t>
+            </w:r>
+            <w:proofErr w:type="spellStart"/>
+            <w:r>
+              <w:rPr>
+                <w:rFonts w:ascii="BRH Devanagari Extra" w:hAnsi="BRH Devanagari Extra" w:cs="BRH Devanagari Extra"/>
+                <w:color w:val="000000"/>
+                <w:sz w:val="40"/>
+                <w:szCs w:val="40"/>
+              </w:rPr>
+              <w:t>SÉqÉþ</w:t>
+            </w:r>
+            <w:proofErr w:type="spellEnd"/>
+            <w:r>
+              <w:rPr>
+                <w:rFonts w:ascii="BRH Devanagari Extra" w:hAnsi="BRH Devanagari Extra" w:cs="BRH Devanagari Extra"/>
+                <w:color w:val="000000"/>
+                <w:sz w:val="40"/>
+                <w:szCs w:val="40"/>
+              </w:rPr>
+              <w:t xml:space="preserve"> |</w:t>
             </w:r>
           </w:p>
         </w:tc>
@@ -5452,6 +6882,7 @@
                 <w:szCs w:val="40"/>
               </w:rPr>
             </w:pPr>
+            <w:proofErr w:type="spellStart"/>
             <w:r>
               <w:rPr>
                 <w:rFonts w:ascii="BRH Devanagari Extra" w:hAnsi="BRH Devanagari Extra" w:cs="BRH Devanagari Extra"/>
@@ -5461,16 +6892,18 @@
               </w:rPr>
               <w:t>qÉÑ</w:t>
             </w:r>
-            <w:r>
-              <w:rPr>
-                <w:rFonts w:ascii="BRH Malayalam Extra" w:hAnsi="BRH Malayalam Extra" w:cs="BRH Devanagari Extra"/>
-                <w:b/>
-                <w:color w:val="000000"/>
-                <w:sz w:val="32"/>
-                <w:szCs w:val="40"/>
-              </w:rPr>
-              <w:t>–</w:t>
-            </w:r>
+            <w:proofErr w:type="spellEnd"/>
+            <w:r>
+              <w:rPr>
+                <w:rFonts w:ascii="BRH Malayalam Extra" w:hAnsi="BRH Malayalam Extra" w:cs="BRH Devanagari Extra"/>
+                <w:b/>
+                <w:color w:val="000000"/>
+                <w:sz w:val="32"/>
+                <w:szCs w:val="40"/>
+              </w:rPr>
+              <w:t>–</w:t>
+            </w:r>
+            <w:proofErr w:type="spellStart"/>
             <w:r>
               <w:rPr>
                 <w:rFonts w:ascii="BRH Devanagari Extra" w:hAnsi="BRH Devanagari Extra" w:cs="BRH Devanagari Extra"/>
@@ -5480,16 +6913,18 @@
               </w:rPr>
               <w:t>gcÉ</w:t>
             </w:r>
-            <w:r>
-              <w:rPr>
-                <w:rFonts w:ascii="BRH Malayalam Extra" w:hAnsi="BRH Malayalam Extra" w:cs="BRH Devanagari Extra"/>
-                <w:b/>
-                <w:color w:val="000000"/>
-                <w:sz w:val="32"/>
-                <w:szCs w:val="40"/>
-              </w:rPr>
-              <w:t>–</w:t>
-            </w:r>
+            <w:proofErr w:type="spellEnd"/>
+            <w:r>
+              <w:rPr>
+                <w:rFonts w:ascii="BRH Malayalam Extra" w:hAnsi="BRH Malayalam Extra" w:cs="BRH Devanagari Extra"/>
+                <w:b/>
+                <w:color w:val="000000"/>
+                <w:sz w:val="32"/>
+                <w:szCs w:val="40"/>
+              </w:rPr>
+              <w:t>–</w:t>
+            </w:r>
+            <w:proofErr w:type="spellStart"/>
             <w:r>
               <w:rPr>
                 <w:rFonts w:ascii="BRH Devanagari Extra" w:hAnsi="BRH Devanagari Extra" w:cs="BRH Devanagari Extra"/>
@@ -5499,25 +6934,37 @@
               </w:rPr>
               <w:t>ÌiÉ</w:t>
             </w:r>
-            <w:r>
-              <w:rPr>
-                <w:rFonts w:ascii="BRH Malayalam Extra" w:hAnsi="BRH Malayalam Extra" w:cs="BRH Devanagari Extra"/>
-                <w:b/>
-                <w:color w:val="000000"/>
-                <w:sz w:val="32"/>
-                <w:szCs w:val="40"/>
-              </w:rPr>
-              <w:t>–</w:t>
-            </w:r>
-            <w:r>
-              <w:rPr>
-                <w:rFonts w:ascii="BRH Devanagari Extra" w:hAnsi="BRH Devanagari Extra" w:cs="BRH Devanagari Extra"/>
-                <w:color w:val="000000"/>
-                <w:sz w:val="40"/>
-                <w:szCs w:val="40"/>
-              </w:rPr>
-              <w:t xml:space="preserve"> ÌWû</w:t>
-            </w:r>
+            <w:proofErr w:type="spellEnd"/>
+            <w:r>
+              <w:rPr>
+                <w:rFonts w:ascii="BRH Malayalam Extra" w:hAnsi="BRH Malayalam Extra" w:cs="BRH Devanagari Extra"/>
+                <w:b/>
+                <w:color w:val="000000"/>
+                <w:sz w:val="32"/>
+                <w:szCs w:val="40"/>
+              </w:rPr>
+              <w:t>–</w:t>
+            </w:r>
+            <w:r>
+              <w:rPr>
+                <w:rFonts w:ascii="BRH Devanagari Extra" w:hAnsi="BRH Devanagari Extra" w:cs="BRH Devanagari Extra"/>
+                <w:color w:val="000000"/>
+                <w:sz w:val="40"/>
+                <w:szCs w:val="40"/>
+              </w:rPr>
+              <w:t xml:space="preserve"> </w:t>
+            </w:r>
+            <w:proofErr w:type="spellStart"/>
+            <w:r>
+              <w:rPr>
+                <w:rFonts w:ascii="BRH Devanagari Extra" w:hAnsi="BRH Devanagari Extra" w:cs="BRH Devanagari Extra"/>
+                <w:color w:val="000000"/>
+                <w:sz w:val="40"/>
+                <w:szCs w:val="40"/>
+              </w:rPr>
+              <w:t>ÌWû</w:t>
+            </w:r>
+            <w:proofErr w:type="spellEnd"/>
             <w:r>
               <w:rPr>
                 <w:rFonts w:ascii="BRH Malayalam Extra" w:hAnsi="BRH Malayalam Extra" w:cs="BRH Devanagari Extra"/>
@@ -5547,14 +6994,25 @@
               </w:rPr>
               <w:t>–</w:t>
             </w:r>
-            <w:r>
-              <w:rPr>
-                <w:rFonts w:ascii="BRH Devanagari Extra" w:hAnsi="BRH Devanagari Extra" w:cs="BRH Devanagari Extra"/>
-                <w:color w:val="000000"/>
-                <w:sz w:val="40"/>
-                <w:szCs w:val="40"/>
-              </w:rPr>
-              <w:t xml:space="preserve">hqÉrÉÿqÉç | </w:t>
+            <w:proofErr w:type="spellStart"/>
+            <w:r>
+              <w:rPr>
+                <w:rFonts w:ascii="BRH Devanagari Extra" w:hAnsi="BRH Devanagari Extra" w:cs="BRH Devanagari Extra"/>
+                <w:color w:val="000000"/>
+                <w:sz w:val="40"/>
+                <w:szCs w:val="40"/>
+              </w:rPr>
+              <w:t>hqÉrÉÿqÉç</w:t>
+            </w:r>
+            <w:proofErr w:type="spellEnd"/>
+            <w:r>
+              <w:rPr>
+                <w:rFonts w:ascii="BRH Devanagari Extra" w:hAnsi="BRH Devanagari Extra" w:cs="BRH Devanagari Extra"/>
+                <w:color w:val="000000"/>
+                <w:sz w:val="40"/>
+                <w:szCs w:val="40"/>
+              </w:rPr>
+              <w:t xml:space="preserve"> | </w:t>
             </w:r>
           </w:p>
           <w:p>
@@ -5571,6 +7029,7 @@
                 <w:szCs w:val="40"/>
               </w:rPr>
             </w:pPr>
+            <w:proofErr w:type="spellStart"/>
             <w:r>
               <w:rPr>
                 <w:rFonts w:ascii="BRH Devanagari Extra" w:hAnsi="BRH Devanagari Extra" w:cs="BRH Devanagari Extra"/>
@@ -5580,6 +7039,7 @@
               </w:rPr>
               <w:t>ÌWû</w:t>
             </w:r>
+            <w:proofErr w:type="spellEnd"/>
             <w:r>
               <w:rPr>
                 <w:rFonts w:ascii="BRH Malayalam Extra" w:hAnsi="BRH Malayalam Extra" w:cs="BRH Devanagari Extra"/>
@@ -5609,6 +7069,7 @@
               </w:rPr>
               <w:t>–</w:t>
             </w:r>
+            <w:proofErr w:type="spellStart"/>
             <w:r>
               <w:rPr>
                 <w:rFonts w:ascii="BRH Devanagari Extra" w:hAnsi="BRH Devanagari Extra" w:cs="BRH Devanagari Extra"/>
@@ -5637,24 +7098,45 @@
               </w:rPr>
               <w:t>rÉ</w:t>
             </w:r>
-            <w:r>
-              <w:rPr>
-                <w:rFonts w:ascii="BRH Malayalam Extra" w:hAnsi="BRH Malayalam Extra" w:cs="BRH Devanagari Extra"/>
-                <w:b/>
-                <w:color w:val="000000"/>
-                <w:sz w:val="32"/>
-                <w:szCs w:val="40"/>
-              </w:rPr>
-              <w:t>–</w:t>
-            </w:r>
-            <w:r>
-              <w:rPr>
-                <w:rFonts w:ascii="BRH Devanagari Extra" w:hAnsi="BRH Devanagari Extra" w:cs="BRH Devanagari Extra"/>
-                <w:color w:val="000000"/>
-                <w:sz w:val="40"/>
-                <w:szCs w:val="40"/>
-              </w:rPr>
-              <w:t>Ç SÉqÉþ |</w:t>
+            <w:proofErr w:type="spellEnd"/>
+            <w:r>
+              <w:rPr>
+                <w:rFonts w:ascii="BRH Malayalam Extra" w:hAnsi="BRH Malayalam Extra" w:cs="BRH Devanagari Extra"/>
+                <w:b/>
+                <w:color w:val="000000"/>
+                <w:sz w:val="32"/>
+                <w:szCs w:val="40"/>
+              </w:rPr>
+              <w:t>–</w:t>
+            </w:r>
+            <w:r>
+              <w:rPr>
+                <w:rFonts w:ascii="BRH Devanagari Extra" w:hAnsi="BRH Devanagari Extra" w:cs="BRH Devanagari Extra"/>
+                <w:color w:val="000000"/>
+                <w:sz w:val="40"/>
+                <w:szCs w:val="40"/>
+              </w:rPr>
+              <w:t xml:space="preserve">Ç </w:t>
+            </w:r>
+            <w:proofErr w:type="spellStart"/>
+            <w:r>
+              <w:rPr>
+                <w:rFonts w:ascii="BRH Devanagari Extra" w:hAnsi="BRH Devanagari Extra" w:cs="BRH Devanagari Extra"/>
+                <w:color w:val="000000"/>
+                <w:sz w:val="40"/>
+                <w:szCs w:val="40"/>
+              </w:rPr>
+              <w:t>SÉqÉþ</w:t>
+            </w:r>
+            <w:proofErr w:type="spellEnd"/>
+            <w:r>
+              <w:rPr>
+                <w:rFonts w:ascii="BRH Devanagari Extra" w:hAnsi="BRH Devanagari Extra" w:cs="BRH Devanagari Extra"/>
+                <w:color w:val="000000"/>
+                <w:sz w:val="40"/>
+                <w:szCs w:val="40"/>
+              </w:rPr>
+              <w:t xml:space="preserve"> |</w:t>
             </w:r>
           </w:p>
         </w:tc>
@@ -5855,25 +7337,37 @@
                 <w:szCs w:val="40"/>
               </w:rPr>
             </w:pPr>
-            <w:r>
-              <w:rPr>
-                <w:rFonts w:ascii="BRH Devanagari Extra" w:hAnsi="BRH Devanagari Extra" w:cs="BRH Devanagari Extra"/>
-                <w:color w:val="000000"/>
-                <w:sz w:val="40"/>
-                <w:szCs w:val="40"/>
-              </w:rPr>
-              <w:t>iuÉÍqÉþlSì | C</w:t>
-            </w:r>
-            <w:r>
-              <w:rPr>
-                <w:rFonts w:ascii="BRH Malayalam Extra" w:hAnsi="BRH Malayalam Extra" w:cs="BRH Devanagari Extra"/>
-                <w:b/>
-                <w:color w:val="000000"/>
-                <w:sz w:val="32"/>
-                <w:szCs w:val="40"/>
-              </w:rPr>
-              <w:t>–</w:t>
-            </w:r>
+            <w:proofErr w:type="spellStart"/>
+            <w:r>
+              <w:rPr>
+                <w:rFonts w:ascii="BRH Devanagari Extra" w:hAnsi="BRH Devanagari Extra" w:cs="BRH Devanagari Extra"/>
+                <w:color w:val="000000"/>
+                <w:sz w:val="40"/>
+                <w:szCs w:val="40"/>
+              </w:rPr>
+              <w:t>iuÉÍqÉþlSì</w:t>
+            </w:r>
+            <w:proofErr w:type="spellEnd"/>
+            <w:r>
+              <w:rPr>
+                <w:rFonts w:ascii="BRH Devanagari Extra" w:hAnsi="BRH Devanagari Extra" w:cs="BRH Devanagari Extra"/>
+                <w:color w:val="000000"/>
+                <w:sz w:val="40"/>
+                <w:szCs w:val="40"/>
+              </w:rPr>
+              <w:t xml:space="preserve"> | C</w:t>
+            </w:r>
+            <w:r>
+              <w:rPr>
+                <w:rFonts w:ascii="BRH Malayalam Extra" w:hAnsi="BRH Malayalam Extra" w:cs="BRH Devanagari Extra"/>
+                <w:b/>
+                <w:color w:val="000000"/>
+                <w:sz w:val="32"/>
+                <w:szCs w:val="40"/>
+              </w:rPr>
+              <w:t>–</w:t>
+            </w:r>
+            <w:proofErr w:type="spellStart"/>
             <w:r>
               <w:rPr>
                 <w:rFonts w:ascii="BRH Devanagari Extra" w:hAnsi="BRH Devanagari Extra" w:cs="BRH Devanagari Extra"/>
@@ -5884,6 +7378,7 @@
               </w:rPr>
               <w:t>lSìÉ</w:t>
             </w:r>
+            <w:proofErr w:type="spellEnd"/>
             <w:r>
               <w:rPr>
                 <w:rFonts w:ascii="BRH Malayalam Extra" w:hAnsi="BRH Malayalam Extra" w:cs="BRH Devanagari Extra"/>
@@ -5903,8 +7398,20 @@
                 <w:szCs w:val="40"/>
                 <w:highlight w:val="yellow"/>
               </w:rPr>
-              <w:t xml:space="preserve"> ÅÍxÉ</w:t>
-            </w:r>
+              <w:t xml:space="preserve"> </w:t>
+            </w:r>
+            <w:proofErr w:type="spellStart"/>
+            <w:r>
+              <w:rPr>
+                <w:rFonts w:ascii="BRH Devanagari Extra" w:hAnsi="BRH Devanagari Extra" w:cs="BRH Devanagari Extra"/>
+                <w:color w:val="000000"/>
+                <w:sz w:val="40"/>
+                <w:szCs w:val="40"/>
+                <w:highlight w:val="yellow"/>
+              </w:rPr>
+              <w:t>ÅÍxÉ</w:t>
+            </w:r>
+            <w:proofErr w:type="spellEnd"/>
             <w:r>
               <w:rPr>
                 <w:rFonts w:ascii="BRH Malayalam Extra" w:hAnsi="BRH Malayalam Extra" w:cs="BRH Devanagari Extra"/>
@@ -5950,25 +7457,37 @@
                 <w:szCs w:val="40"/>
               </w:rPr>
             </w:pPr>
-            <w:r>
-              <w:rPr>
-                <w:rFonts w:ascii="BRH Devanagari Extra" w:hAnsi="BRH Devanagari Extra" w:cs="BRH Devanagari Extra"/>
-                <w:color w:val="000000"/>
-                <w:sz w:val="40"/>
-                <w:szCs w:val="40"/>
-              </w:rPr>
-              <w:t>iuÉÍqÉþlSì | C</w:t>
-            </w:r>
-            <w:r>
-              <w:rPr>
-                <w:rFonts w:ascii="BRH Malayalam Extra" w:hAnsi="BRH Malayalam Extra" w:cs="BRH Devanagari Extra"/>
-                <w:b/>
-                <w:color w:val="000000"/>
-                <w:sz w:val="32"/>
-                <w:szCs w:val="40"/>
-              </w:rPr>
-              <w:t>–</w:t>
-            </w:r>
+            <w:proofErr w:type="spellStart"/>
+            <w:r>
+              <w:rPr>
+                <w:rFonts w:ascii="BRH Devanagari Extra" w:hAnsi="BRH Devanagari Extra" w:cs="BRH Devanagari Extra"/>
+                <w:color w:val="000000"/>
+                <w:sz w:val="40"/>
+                <w:szCs w:val="40"/>
+              </w:rPr>
+              <w:t>iuÉÍqÉþlSì</w:t>
+            </w:r>
+            <w:proofErr w:type="spellEnd"/>
+            <w:r>
+              <w:rPr>
+                <w:rFonts w:ascii="BRH Devanagari Extra" w:hAnsi="BRH Devanagari Extra" w:cs="BRH Devanagari Extra"/>
+                <w:color w:val="000000"/>
+                <w:sz w:val="40"/>
+                <w:szCs w:val="40"/>
+              </w:rPr>
+              <w:t xml:space="preserve"> | C</w:t>
+            </w:r>
+            <w:r>
+              <w:rPr>
+                <w:rFonts w:ascii="BRH Malayalam Extra" w:hAnsi="BRH Malayalam Extra" w:cs="BRH Devanagari Extra"/>
+                <w:b/>
+                <w:color w:val="000000"/>
+                <w:sz w:val="32"/>
+                <w:szCs w:val="40"/>
+              </w:rPr>
+              <w:t>–</w:t>
+            </w:r>
+            <w:proofErr w:type="spellStart"/>
             <w:r>
               <w:rPr>
                 <w:rFonts w:ascii="BRH Devanagari Extra" w:hAnsi="BRH Devanagari Extra" w:cs="BRH Devanagari Extra"/>
@@ -5979,6 +7498,7 @@
               </w:rPr>
               <w:t>lSìÉ</w:t>
             </w:r>
+            <w:proofErr w:type="spellEnd"/>
             <w:r>
               <w:rPr>
                 <w:rFonts w:ascii="BRH Malayalam Extra" w:hAnsi="BRH Malayalam Extra" w:cs="BRH Devanagari Extra"/>
@@ -5990,6 +7510,7 @@
               </w:rPr>
               <w:t>–</w:t>
             </w:r>
+            <w:proofErr w:type="spellStart"/>
             <w:r>
               <w:rPr>
                 <w:rFonts w:ascii="BRH Devanagari Extra" w:hAnsi="BRH Devanagari Extra" w:cs="BRH Devanagari Extra"/>
@@ -6000,6 +7521,7 @@
               </w:rPr>
               <w:t>ÍxÉ</w:t>
             </w:r>
+            <w:proofErr w:type="spellEnd"/>
             <w:r>
               <w:rPr>
                 <w:rFonts w:ascii="BRH Malayalam Extra" w:hAnsi="BRH Malayalam Extra" w:cs="BRH Devanagari Extra"/>
@@ -6025,8 +7547,17 @@
                 <w:b/>
                 <w:bCs/>
               </w:rPr>
-              <w:t>(avagraham</w:t>
-            </w:r>
+              <w:t>(</w:t>
+            </w:r>
+            <w:proofErr w:type="spellStart"/>
+            <w:r>
+              <w:rPr>
+                <w:b/>
+                <w:bCs/>
+              </w:rPr>
+              <w:t>avagraham</w:t>
+            </w:r>
+            <w:proofErr w:type="spellEnd"/>
             <w:r>
               <w:rPr>
                 <w:rFonts w:ascii="BRH Devanagari Extra" w:hAnsi="BRH Devanagari Extra" w:cs="BRH Devanagari Extra"/>
@@ -6075,7 +7606,29 @@
           <w:szCs w:val="40"/>
           <w:lang w:val="en-IN" w:eastAsia="en-IN"/>
         </w:rPr>
-        <w:t xml:space="preserve">"zlÉ" </w:t>
+        <w:t>"</w:t>
+      </w:r>
+      <w:proofErr w:type="spellStart"/>
+      <w:r>
+        <w:rPr>
+          <w:rFonts w:ascii="BRH Devanagari" w:hAnsi="BRH Devanagari" w:cs="BRH Devanagari"/>
+          <w:color w:val="000000"/>
+          <w:sz w:val="40"/>
+          <w:szCs w:val="40"/>
+          <w:lang w:val="en-IN" w:eastAsia="en-IN"/>
+        </w:rPr>
+        <w:t>zlÉ</w:t>
+      </w:r>
+      <w:proofErr w:type="spellEnd"/>
+      <w:r>
+        <w:rPr>
+          <w:rFonts w:ascii="BRH Devanagari" w:hAnsi="BRH Devanagari" w:cs="BRH Devanagari"/>
+          <w:color w:val="000000"/>
+          <w:sz w:val="40"/>
+          <w:szCs w:val="40"/>
+          <w:lang w:val="en-IN" w:eastAsia="en-IN"/>
+        </w:rPr>
+        <w:t xml:space="preserve">" </w:t>
       </w:r>
       <w:r>
         <w:rPr>
@@ -6083,7 +7636,16 @@
           <w:bCs/>
           <w:sz w:val="32"/>
         </w:rPr>
-        <w:t>replaced with</w:t>
+        <w:t xml:space="preserve">replaced </w:t>
+      </w:r>
+      <w:proofErr w:type="gramStart"/>
+      <w:r>
+        <w:rPr>
+          <w:b/>
+          <w:bCs/>
+          <w:sz w:val="32"/>
+        </w:rPr>
+        <w:t>with</w:t>
       </w:r>
       <w:r>
         <w:rPr>
@@ -6105,6 +7667,8 @@
         </w:rPr>
         <w:t>"</w:t>
       </w:r>
+      <w:proofErr w:type="spellStart"/>
+      <w:proofErr w:type="gramEnd"/>
       <w:r>
         <w:rPr>
           <w:rFonts w:ascii="BRH Devanagari" w:hAnsi="BRH Devanagari" w:cs="BRH Devanagari"/>
@@ -6116,6 +7680,7 @@
         </w:rPr>
         <w:t>zgÉ</w:t>
       </w:r>
+      <w:proofErr w:type="spellEnd"/>
       <w:r>
         <w:rPr>
           <w:rFonts w:ascii="BRH Devanagari" w:hAnsi="BRH Devanagari" w:cs="BRH Devanagari"/>
@@ -6481,6 +8046,7 @@
           <w:b/>
           <w:sz w:val="36"/>
         </w:rPr>
+        <w:lastRenderedPageBreak/>
         <w:t>==========================</w:t>
       </w:r>
     </w:p>
@@ -6577,14 +8143,35 @@
         <w:bCs/>
       </w:rPr>
       <w:tab/>
-      <w:t xml:space="preserve">              v</w:t>
+      <w:t xml:space="preserve">              </w:t>
     </w:r>
     <w:r>
       <w:rPr>
         <w:b/>
         <w:bCs/>
       </w:rPr>
-      <w:t>edavms@gmail.com</w:t>
+      <w:t>www.</w:t>
+    </w:r>
+    <w:r>
+      <w:rPr>
+        <w:b/>
+        <w:bCs/>
+      </w:rPr>
+      <w:t>v</w:t>
+    </w:r>
+    <w:r>
+      <w:rPr>
+        <w:b/>
+        <w:bCs/>
+      </w:rPr>
+      <w:t>edavms</w:t>
+    </w:r>
+    <w:r>
+      <w:rPr>
+        <w:b/>
+        <w:bCs/>
+      </w:rPr>
+      <w:t>.in</w:t>
     </w:r>
     <w:r>
       <w:rPr>
@@ -6603,6 +8190,9 @@
     </w:r>
     <w:r>
       <w:tab/>
+    </w:r>
+    <w:r>
+      <w:t xml:space="preserve">                      </w:t>
     </w:r>
     <w:r>
       <w:tab/>
@@ -6794,6 +8384,19 @@
         <w:bCs/>
       </w:rPr>
       <w:tab/>
+    </w:r>
+    <w:r>
+      <w:rPr>
+        <w:b/>
+        <w:bCs/>
+      </w:rPr>
+      <w:t xml:space="preserve">           </w:t>
+    </w:r>
+    <w:r>
+      <w:rPr>
+        <w:b/>
+        <w:bCs/>
+      </w:rPr>
       <w:t xml:space="preserve"> </w:t>
     </w:r>
     <w:r>

</xml_diff>